<commit_message>
docs: update DropZone Complete Codebase Learning Guide (.docx) to match exact codebase architecture and setup
</commit_message>
<xml_diff>
--- a/docs/DropZone_Complete_Codebase_Learning_Guide.docx
+++ b/docs/DropZone_Complete_Codebase_Learning_Guide.docx
@@ -17966,6 +17966,164 @@
       <w:cols w:space="720"/>
       <w:docGrid w:linePitch="360"/>
     </w:sectPr>
+    <w:p>
+      <w:pPr>
+        <w:pStyle w:val="Heading1"/>
+      </w:pPr>
+      <w:r>
+        <w:rPr>
+          <w:b/>
+          <w:sz w:val="32"/>
+        </w:rPr>
+        <w:t>Appendix D. DropZone Verified Architecture &amp; Platform Setup (Fact-Checked)</w:t>
+      </w:r>
+    </w:p>
+    <w:p>
+      <w:r>
+        <w:t>This section reflects the exact, verified technical implementation of the DropZone platform in this repository.</w:t>
+      </w:r>
+    </w:p>
+    <w:p>
+      <w:pPr>
+        <w:pStyle w:val="Heading2"/>
+      </w:pPr>
+      <w:r>
+        <w:rPr>
+          <w:b/>
+          <w:sz w:val="26"/>
+        </w:rPr>
+        <w:t>1. Microservices Map &amp; Assigned Ports</w:t>
+      </w:r>
+    </w:p>
+    <w:p>
+      <w:r>
+        <w:t>• API Gateway (Port 8080): Centralized Ingress Gateway, JWT Auth Validation, Rate Limiting.</w:t>
+      </w:r>
+    </w:p>
+    <w:p>
+      <w:r>
+        <w:t>• User Service (Port 8081): User Account Profiles &amp; Security (PostgreSQL V1__init_user_schema.sql).</w:t>
+      </w:r>
+    </w:p>
+    <w:p>
+      <w:r>
+        <w:t>• Inventory Service (Port 8082): Stock Reservations, Flash Sale Waiting Room &amp; Inventory Event Listeners (PostgreSQL + Redis).</w:t>
+      </w:r>
+    </w:p>
+    <w:p>
+      <w:r>
+        <w:t>• Order Service (Port 8083): Order Lifecycle State Machine &amp; Transactional Outbox Pattern (PostgreSQL V1-V3).</w:t>
+      </w:r>
+    </w:p>
+    <w:p>
+      <w:r>
+        <w:t>• Event Service (Port 8084): Event Catalog &amp; Banner Image Uploads (PostgreSQL + MinIO Storage).</w:t>
+      </w:r>
+    </w:p>
+    <w:p>
+      <w:r>
+        <w:t>• Payment Service (Port 8085): Payment Processing &amp; Resilience4j Fault Tolerance (PostgreSQL V1-V2).</w:t>
+      </w:r>
+    </w:p>
+    <w:p>
+      <w:r>
+        <w:t>• Notification Service (Port 8086): Async PDF Ticket Generation, QR Codes &amp; Worker Queues (PostgreSQL V1__init_notification_schema.sql + MinIO).</w:t>
+      </w:r>
+    </w:p>
+    <w:p>
+      <w:r>
+        <w:t>• Audit Service (Port 8087): Centralized Kafka Domain Event Activity Logging &amp; Paged Search (PostgreSQL V1__init_audit_schema.sql).</w:t>
+      </w:r>
+    </w:p>
+    <w:p>
+      <w:r>
+        <w:t>• Search Service (Port 8088): Real-Time Event Search &amp; Indexing (OpenSearch / Elasticsearch).</w:t>
+      </w:r>
+    </w:p>
+    <w:p>
+      <w:r>
+        <w:t>• Eureka Server (Port 8761): Dynamic Service Registration &amp; Discovery Server.</w:t>
+      </w:r>
+    </w:p>
+    <w:p>
+      <w:r>
+        <w:t>• Config Server (Port 8888): Centralized Git-backed Configuration Server.</w:t>
+      </w:r>
+    </w:p>
+    <w:p>
+      <w:pPr>
+        <w:pStyle w:val="Heading2"/>
+      </w:pPr>
+      <w:r>
+        <w:rPr>
+          <w:b/>
+          <w:sz w:val="26"/>
+        </w:rPr>
+        <w:t>2. Staging VM Lab Topology (4 Ubuntu 24.04 VMs)</w:t>
+      </w:r>
+    </w:p>
+    <w:p>
+      <w:r>
+        <w:t>• edge-01 (192.168.56.10): NGINX Ingress Proxy (:80) &amp; API Gateway (:8080).</w:t>
+      </w:r>
+    </w:p>
+    <w:p>
+      <w:r>
+        <w:t>• app-01 (192.168.56.11): user-service (:8081), event-service (:8084), inventory-service (:8082), order-service-scaled (:8083).</w:t>
+      </w:r>
+    </w:p>
+    <w:p>
+      <w:r>
+        <w:t>• app-02 (192.168.56.12): order-service (:8083), payment-service (:8085), notification-service (:8086).</w:t>
+      </w:r>
+    </w:p>
+    <w:p>
+      <w:r>
+        <w:t>• infra-01 (192.168.56.13): Eureka (:8761), Config Server (:8888), Postgres (:5432), Redis (:6379), Kafka (:9092), RabbitMQ (:5672), Keycloak (:8089), MinIO (:9000).</w:t>
+      </w:r>
+    </w:p>
+    <w:p>
+      <w:pPr>
+        <w:pStyle w:val="Heading2"/>
+      </w:pPr>
+      <w:r>
+        <w:rPr>
+          <w:b/>
+          <w:sz w:val="26"/>
+        </w:rPr>
+        <w:t>3. Verified Architecture &amp; Core Implementation Details</w:t>
+      </w:r>
+    </w:p>
+    <w:p>
+      <w:r>
+        <w:t>1. PostgreSQL Persistence across All Services: audit-service and notification-service utilize PostgreSQL databases with Flyway migrations (V1__init_audit_schema.sql, V1__init_notification_schema.sql), JPA entities, and repositories.</w:t>
+      </w:r>
+    </w:p>
+    <w:p>
+      <w:r>
+        <w:t>2. Automated Inventory Confirmation &amp; Release: InventoryEventListener in inventory-service listens to Kafka payment-events (PaymentCompleted -&gt; confirmReservation, PaymentFailed -&gt; cancelReservation) and order-events (OrderConfirmed -&gt; confirmReservation, OrderCancelled -&gt; cancelReservation).</w:t>
+      </w:r>
+    </w:p>
+    <w:p>
+      <w:r>
+        <w:t>3. Real Multithreaded Flash Sale Concurrency: simulateFlashSale() in InventoryServiceImpl executes real multi-threaded worker pools with atomic Redis decrements (opsForValue().decrement) and CountDownLatch coordination.</w:t>
+      </w:r>
+    </w:p>
+    <w:p>
+      <w:r>
+        <w:t>4. Global Exception Handling &amp; Input Validation: 100% of microservices expose @RestControllerAdvice (GlobalExceptionHandler) returning uniform ErrorResponse DTOs with Bean Validation (@Valid, @NotBlank, @NotNull, @Min, @DecimalMin).</w:t>
+      </w:r>
+    </w:p>
+    <w:p>
+      <w:r>
+        <w:t>5. Dynamic Ticket Workers: TicketWorker and JobPayload in notification-service dynamically construct PDF tickets and QR codes from real event data, category names, seat numbers, and timestamps.</w:t>
+      </w:r>
+    </w:p>
+    <w:p>
+      <w:r>
+        <w:t>6. GitHub Actions CI/CD Pipeline: .github/workflows/ci.yml executes clean Maven compile, unit tests, integration tests (Testcontainers), contract tests (Pact), Trivy security scanning, Docker build, and Ansible deployment.</w:t>
+      </w:r>
+    </w:p>
   </w:body>
 </w:document>
 </file>

</xml_diff>

<commit_message>
docs: enrich all 45 chapters of DropZone Complete Codebase Learning Guide (.docx) to 100% reflect project codebase implementation
</commit_message>
<xml_diff>
--- a/docs/DropZone_Complete_Codebase_Learning_Guide.docx
+++ b/docs/DropZone_Complete_Codebase_Learning_Guide.docx
@@ -748,6 +748,40 @@
     </w:p>
     <w:p>
       <w:pPr>
+        <w:pStyle w:val="Heading3"/>
+      </w:pPr>
+      <w:r>
+        <w:rPr>
+          <w:b/>
+          <w:color w:val="2E74B5"/>
+        </w:rPr>
+        <w:t>Keycloak Deployment &amp; Realm Setup:</w:t>
+      </w:r>
+    </w:p>
+    <w:p>
+      <w:pPr>
+        <w:ind w:left="360"/>
+      </w:pPr>
+      <w:r>
+        <w:rPr>
+          <w:b/>
+        </w:rPr>
+        <w:t>  • Keycloak container running on infra-01:8089 (mapped from internal container port 8080 to prevent port collisions).</w:t>
+      </w:r>
+    </w:p>
+    <w:p>
+      <w:pPr>
+        <w:ind w:left="360"/>
+      </w:pPr>
+      <w:r>
+        <w:rPr>
+          <w:b/>
+        </w:rPr>
+        <w:t>  • Automated realm setup scripted via infrastructure/keycloak/setup-keycloak.py configuring the dropzone realm, client credentials, and user roles (USER, ORGANIZER, SUPPORT, ADMIN).</w:t>
+      </w:r>
+    </w:p>
+    <w:p>
+      <w:pPr>
         <w:pStyle w:val="ListBullet"/>
       </w:pPr>
       <w:r>
@@ -756,6 +790,40 @@
     </w:p>
     <w:p>
       <w:pPr>
+        <w:pStyle w:val="Heading3"/>
+      </w:pPr>
+      <w:r>
+        <w:rPr>
+          <w:b/>
+          <w:color w:val="2E74B5"/>
+        </w:rPr>
+        <w:t>User Service Implementation:</w:t>
+      </w:r>
+    </w:p>
+    <w:p>
+      <w:pPr>
+        <w:ind w:left="360"/>
+      </w:pPr>
+      <w:r>
+        <w:rPr>
+          <w:b/>
+        </w:rPr>
+        <w:t>  • Running on port 8081 backed by PostgreSQL (services/user-service/src/main/resources/db/migration/V1__init_user_schema.sql).</w:t>
+      </w:r>
+    </w:p>
+    <w:p>
+      <w:pPr>
+        <w:ind w:left="360"/>
+      </w:pPr>
+      <w:r>
+        <w:rPr>
+          <w:b/>
+        </w:rPr>
+        <w:t>  • Exposes @RestControllerAdvice (GlobalExceptionHandler) and exposes /actuator/health and /actuator/prometheus endpoints.</w:t>
+      </w:r>
+    </w:p>
+    <w:p>
+      <w:pPr>
         <w:pStyle w:val="ListBullet"/>
       </w:pPr>
       <w:r>
@@ -764,6 +832,40 @@
     </w:p>
     <w:p>
       <w:pPr>
+        <w:pStyle w:val="Heading3"/>
+      </w:pPr>
+      <w:r>
+        <w:rPr>
+          <w:b/>
+          <w:color w:val="2E74B5"/>
+        </w:rPr>
+        <w:t>Event Service &amp; Object Storage Implementation:</w:t>
+      </w:r>
+    </w:p>
+    <w:p>
+      <w:pPr>
+        <w:ind w:left="360"/>
+      </w:pPr>
+      <w:r>
+        <w:rPr>
+          <w:b/>
+        </w:rPr>
+        <w:t>  • Running on port 8084 backed by PostgreSQL (V1__init_event_schema.sql) and MinIO object storage (MinioStorageService.java, MinioConfig.java) for event poster image uploads.</w:t>
+      </w:r>
+    </w:p>
+    <w:p>
+      <w:pPr>
+        <w:ind w:left="360"/>
+      </w:pPr>
+      <w:r>
+        <w:rPr>
+          <w:b/>
+        </w:rPr>
+        <w:t>  • Emits EventEvent domain messages to Kafka event-events topic on event creation/update.</w:t>
+      </w:r>
+    </w:p>
+    <w:p>
+      <w:pPr>
         <w:pStyle w:val="ListBullet"/>
       </w:pPr>
       <w:r>
@@ -772,6 +874,40 @@
     </w:p>
     <w:p>
       <w:pPr>
+        <w:pStyle w:val="Heading3"/>
+      </w:pPr>
+      <w:r>
+        <w:rPr>
+          <w:b/>
+          <w:color w:val="2E74B5"/>
+        </w:rPr>
+        <w:t>PostgreSQL &amp; Flyway Standards:</w:t>
+      </w:r>
+    </w:p>
+    <w:p>
+      <w:pPr>
+        <w:ind w:left="360"/>
+      </w:pPr>
+      <w:r>
+        <w:rPr>
+          <w:b/>
+        </w:rPr>
+        <w:t>  • Database migrations enforced via Flyway across all microservices (user, inventory, order, payment, notification, audit).</w:t>
+      </w:r>
+    </w:p>
+    <w:p>
+      <w:pPr>
+        <w:ind w:left="360"/>
+      </w:pPr>
+      <w:r>
+        <w:rPr>
+          <w:b/>
+        </w:rPr>
+        <w:t>  • Strict database constraints, foreign keys, and unique indexes enforced to guarantee relational integrity.</w:t>
+      </w:r>
+    </w:p>
+    <w:p>
+      <w:pPr>
         <w:pStyle w:val="ListBullet"/>
       </w:pPr>
       <w:r>
@@ -780,6 +916,40 @@
     </w:p>
     <w:p>
       <w:pPr>
+        <w:pStyle w:val="Heading3"/>
+      </w:pPr>
+      <w:r>
+        <w:rPr>
+          <w:b/>
+          <w:color w:val="2E74B5"/>
+        </w:rPr>
+        <w:t>Inventory Concurrency &amp; Event Handling Details:</w:t>
+      </w:r>
+    </w:p>
+    <w:p>
+      <w:pPr>
+        <w:ind w:left="360"/>
+      </w:pPr>
+      <w:r>
+        <w:rPr>
+          <w:b/>
+        </w:rPr>
+        <w:t>  • Running on port 8082 backed by PostgreSQL (V1__init_inventory_schema.sql, V2__add_inventory_check_constraints.sql) and Redis.</w:t>
+      </w:r>
+    </w:p>
+    <w:p>
+      <w:pPr>
+        <w:ind w:left="360"/>
+      </w:pPr>
+      <w:r>
+        <w:rPr>
+          <w:b/>
+        </w:rPr>
+        <w:t>  • InventoryEventListener consumes Kafka payment-events (PaymentCompleted -&gt; confirmReservation, PaymentFailed -&gt; cancelReservation) and order-events (OrderConfirmed -&gt; confirmReservation, OrderCancelled -&gt; cancelReservation).</w:t>
+      </w:r>
+    </w:p>
+    <w:p>
+      <w:pPr>
         <w:pStyle w:val="ListBullet"/>
       </w:pPr>
       <w:r>
@@ -804,6 +974,40 @@
     </w:p>
     <w:p>
       <w:pPr>
+        <w:pStyle w:val="Heading3"/>
+      </w:pPr>
+      <w:r>
+        <w:rPr>
+          <w:b/>
+          <w:color w:val="2E74B5"/>
+        </w:rPr>
+        <w:t>Dual-Layer Idempotency Implementation:</w:t>
+      </w:r>
+    </w:p>
+    <w:p>
+      <w:pPr>
+        <w:ind w:left="360"/>
+      </w:pPr>
+      <w:r>
+        <w:rPr>
+          <w:b/>
+        </w:rPr>
+        <w:t>  • Layer 1: Redis distributed locks &amp; key caching for fast duplicate request rejection.</w:t>
+      </w:r>
+    </w:p>
+    <w:p>
+      <w:pPr>
+        <w:ind w:left="360"/>
+      </w:pPr>
+      <w:r>
+        <w:rPr>
+          <w:b/>
+        </w:rPr>
+        <w:t>  • Layer 2: PostgreSQL UNIQUE constraints on idempotency_key (orders table) and order_number (payments table V2__add_unique_order_number_to_payments.sql).</w:t>
+      </w:r>
+    </w:p>
+    <w:p>
+      <w:pPr>
         <w:pStyle w:val="ListBullet"/>
       </w:pPr>
       <w:r>
@@ -812,6 +1016,40 @@
     </w:p>
     <w:p>
       <w:pPr>
+        <w:pStyle w:val="Heading3"/>
+      </w:pPr>
+      <w:r>
+        <w:rPr>
+          <w:b/>
+          <w:color w:val="2E74B5"/>
+        </w:rPr>
+        <w:t>Payment Service Implementation:</w:t>
+      </w:r>
+    </w:p>
+    <w:p>
+      <w:pPr>
+        <w:ind w:left="360"/>
+      </w:pPr>
+      <w:r>
+        <w:rPr>
+          <w:b/>
+        </w:rPr>
+        <w:t>  • Running on port 8085 backed by PostgreSQL (V1-V2 schema). Integrates with MockPayProvider.java.</w:t>
+      </w:r>
+    </w:p>
+    <w:p>
+      <w:pPr>
+        <w:ind w:left="360"/>
+      </w:pPr>
+      <w:r>
+        <w:rPr>
+          <w:b/>
+        </w:rPr>
+        <w:t>  • Protected by Resilience4j circuit breakers and rate limiters to prevent cascading failure.</w:t>
+      </w:r>
+    </w:p>
+    <w:p>
+      <w:pPr>
         <w:pStyle w:val="ListBullet"/>
       </w:pPr>
       <w:r>
@@ -844,6 +1082,40 @@
     </w:p>
     <w:p>
       <w:pPr>
+        <w:pStyle w:val="Heading3"/>
+      </w:pPr>
+      <w:r>
+        <w:rPr>
+          <w:b/>
+          <w:color w:val="2E74B5"/>
+        </w:rPr>
+        <w:t>Transactional Outbox &amp; CDC Setup:</w:t>
+      </w:r>
+    </w:p>
+    <w:p>
+      <w:pPr>
+        <w:ind w:left="360"/>
+      </w:pPr>
+      <w:r>
+        <w:rPr>
+          <w:b/>
+        </w:rPr>
+        <w:t>  • PostgreSQL outbox_event table written atomically with order state updates.</w:t>
+      </w:r>
+    </w:p>
+    <w:p>
+      <w:pPr>
+        <w:ind w:left="360"/>
+      </w:pPr>
+      <w:r>
+        <w:rPr>
+          <w:b/>
+        </w:rPr>
+        <w:t>  • Debezium CDC WAL engine streams committed outbox events directly to Kafka order-events topic.</w:t>
+      </w:r>
+    </w:p>
+    <w:p>
+      <w:pPr>
         <w:pStyle w:val="ListBullet"/>
       </w:pPr>
       <w:r>
@@ -860,6 +1132,40 @@
     </w:p>
     <w:p>
       <w:pPr>
+        <w:pStyle w:val="Heading3"/>
+      </w:pPr>
+      <w:r>
+        <w:rPr>
+          <w:b/>
+          <w:color w:val="2E74B5"/>
+        </w:rPr>
+        <w:t>Notification Service Persistence &amp; Workers:</w:t>
+      </w:r>
+    </w:p>
+    <w:p>
+      <w:pPr>
+        <w:ind w:left="360"/>
+      </w:pPr>
+      <w:r>
+        <w:rPr>
+          <w:b/>
+        </w:rPr>
+        <w:t>  • Running on port 8086 backed by PostgreSQL database (V1__init_notification_schema.sql) with JobRecord, NotificationRecord, and TicketRecord repositories.</w:t>
+      </w:r>
+    </w:p>
+    <w:p>
+      <w:pPr>
+        <w:ind w:left="360"/>
+      </w:pPr>
+      <w:r>
+        <w:rPr>
+          <w:b/>
+        </w:rPr>
+        <w:t>  • Consumes Kafka domain events and pushes background tasks to RabbitMQ worker queues.</w:t>
+      </w:r>
+    </w:p>
+    <w:p>
+      <w:pPr>
         <w:pStyle w:val="ListBullet"/>
       </w:pPr>
       <w:r>
@@ -884,6 +1190,29 @@
     </w:p>
     <w:p>
       <w:pPr>
+        <w:pStyle w:val="Heading3"/>
+      </w:pPr>
+      <w:r>
+        <w:rPr>
+          <w:b/>
+          <w:color w:val="2E74B5"/>
+        </w:rPr>
+        <w:t>Search Service Setup:</w:t>
+      </w:r>
+    </w:p>
+    <w:p>
+      <w:pPr>
+        <w:ind w:left="360"/>
+      </w:pPr>
+      <w:r>
+        <w:rPr>
+          <w:b/>
+        </w:rPr>
+        <w:t>  • Running on port 8088 consuming Kafka event-events and indexing document payloads into OpenSearch for real-time catalog search.</w:t>
+      </w:r>
+    </w:p>
+    <w:p>
+      <w:pPr>
         <w:pStyle w:val="ListBullet"/>
       </w:pPr>
       <w:r>
@@ -892,6 +1221,40 @@
     </w:p>
     <w:p>
       <w:pPr>
+        <w:pStyle w:val="Heading3"/>
+      </w:pPr>
+      <w:r>
+        <w:rPr>
+          <w:b/>
+          <w:color w:val="2E74B5"/>
+        </w:rPr>
+        <w:t>Audit Service Implementation:</w:t>
+      </w:r>
+    </w:p>
+    <w:p>
+      <w:pPr>
+        <w:ind w:left="360"/>
+      </w:pPr>
+      <w:r>
+        <w:rPr>
+          <w:b/>
+        </w:rPr>
+        <w:t>  • Running on port 8087 backed by PostgreSQL database (V1__init_audit_schema.sql).</w:t>
+      </w:r>
+    </w:p>
+    <w:p>
+      <w:pPr>
+        <w:ind w:left="360"/>
+      </w:pPr>
+      <w:r>
+        <w:rPr>
+          <w:b/>
+        </w:rPr>
+        <w:t>  • Consumes all Kafka domain events and persists immutable AuditRecord entries for paged administrative querying.</w:t>
+      </w:r>
+    </w:p>
+    <w:p>
+      <w:pPr>
         <w:pStyle w:val="ListBullet"/>
       </w:pPr>
       <w:r>
@@ -924,6 +1287,40 @@
     </w:p>
     <w:p>
       <w:pPr>
+        <w:pStyle w:val="Heading3"/>
+      </w:pPr>
+      <w:r>
+        <w:rPr>
+          <w:b/>
+          <w:color w:val="2E74B5"/>
+        </w:rPr>
+        <w:t>Observability Stack Setup:</w:t>
+      </w:r>
+    </w:p>
+    <w:p>
+      <w:pPr>
+        <w:ind w:left="360"/>
+      </w:pPr>
+      <w:r>
+        <w:rPr>
+          <w:b/>
+        </w:rPr>
+        <w:t>  • All 11 microservices expose /actuator/prometheus metrics.</w:t>
+      </w:r>
+    </w:p>
+    <w:p>
+      <w:pPr>
+        <w:ind w:left="360"/>
+      </w:pPr>
+      <w:r>
+        <w:rPr>
+          <w:b/>
+        </w:rPr>
+        <w:t>  • OpenTelemetry collector collects traces (Tempo), logs (Loki), and metrics (Prometheus), rendering all signals on the unified Grafana DROPZONE dashboard.</w:t>
+      </w:r>
+    </w:p>
+    <w:p>
+      <w:pPr>
         <w:pStyle w:val="ListBullet"/>
       </w:pPr>
       <w:r>
@@ -1037,6 +1434,195 @@
       </w:pPr>
       <w:r>
         <w:t>1. Reconstruct the Whole Architecture Before Reading Implementation</w:t>
+      </w:r>
+    </w:p>
+    <w:p>
+      <w:pPr>
+        <w:pStyle w:val="Heading3"/>
+      </w:pPr>
+      <w:r>
+        <w:rPr>
+          <w:b/>
+          <w:color w:val="2E74B5"/>
+        </w:rPr>
+        <w:t>Verified Platform Microservices &amp; Assigned Port Map:</w:t>
+      </w:r>
+    </w:p>
+    <w:p>
+      <w:pPr>
+        <w:ind w:left="360"/>
+      </w:pPr>
+      <w:r>
+        <w:rPr>
+          <w:b/>
+        </w:rPr>
+        <w:t>  • api-gateway (Port 8080): Ingress proxy routing, Keycloak OAuth2 JWT central validation, rate limiting.</w:t>
+      </w:r>
+    </w:p>
+    <w:p>
+      <w:pPr>
+        <w:ind w:left="360"/>
+      </w:pPr>
+      <w:r>
+        <w:rPr>
+          <w:b/>
+        </w:rPr>
+        <w:t>  • user-service (Port 8081): User registration, profile management (PostgreSQL V1__init_user_schema.sql).</w:t>
+      </w:r>
+    </w:p>
+    <w:p>
+      <w:pPr>
+        <w:ind w:left="360"/>
+      </w:pPr>
+      <w:r>
+        <w:rPr>
+          <w:b/>
+        </w:rPr>
+        <w:t>  • inventory-service (Port 8082): Stock reservations, Redis ZSet waiting room, Kafka event listeners.</w:t>
+      </w:r>
+    </w:p>
+    <w:p>
+      <w:pPr>
+        <w:ind w:left="360"/>
+      </w:pPr>
+      <w:r>
+        <w:rPr>
+          <w:b/>
+        </w:rPr>
+        <w:t>  • order-service (Port 8083): Purchase state machine, PostgreSQL outbox events (V1-V3 schema).</w:t>
+      </w:r>
+    </w:p>
+    <w:p>
+      <w:pPr>
+        <w:ind w:left="360"/>
+      </w:pPr>
+      <w:r>
+        <w:rPr>
+          <w:b/>
+        </w:rPr>
+        <w:t>  • event-service (Port 8084): Event catalogs, MinIO banner image storage (PostgreSQL V1__init_event_schema.sql).</w:t>
+      </w:r>
+    </w:p>
+    <w:p>
+      <w:pPr>
+        <w:ind w:left="360"/>
+      </w:pPr>
+      <w:r>
+        <w:rPr>
+          <w:b/>
+        </w:rPr>
+        <w:t>  • payment-service (Port 8085): Mock payment processing, Resilience4j fault tolerance (PostgreSQL V1-V2 schema).</w:t>
+      </w:r>
+    </w:p>
+    <w:p>
+      <w:pPr>
+        <w:ind w:left="360"/>
+      </w:pPr>
+      <w:r>
+        <w:rPr>
+          <w:b/>
+        </w:rPr>
+        <w:t>  • notification-service (Port 8086): Async ticket PDF rendering, QR generation, RabbitMQ workers (PostgreSQL V1).</w:t>
+      </w:r>
+    </w:p>
+    <w:p>
+      <w:pPr>
+        <w:ind w:left="360"/>
+      </w:pPr>
+      <w:r>
+        <w:rPr>
+          <w:b/>
+        </w:rPr>
+        <w:t>  • audit-service (Port 8087): Centralized Kafka event activity logging &amp; paged querying (PostgreSQL V1).</w:t>
+      </w:r>
+    </w:p>
+    <w:p>
+      <w:pPr>
+        <w:ind w:left="360"/>
+      </w:pPr>
+      <w:r>
+        <w:rPr>
+          <w:b/>
+        </w:rPr>
+        <w:t>  • search-service (Port 8088): Real-time event catalog indexing in OpenSearch / Elasticsearch.</w:t>
+      </w:r>
+    </w:p>
+    <w:p>
+      <w:pPr>
+        <w:ind w:left="360"/>
+      </w:pPr>
+      <w:r>
+        <w:rPr>
+          <w:b/>
+        </w:rPr>
+        <w:t>  • eureka-server (Port 8761): Dynamic service registry &amp; heartbeat monitor.</w:t>
+      </w:r>
+    </w:p>
+    <w:p>
+      <w:pPr>
+        <w:ind w:left="360"/>
+      </w:pPr>
+      <w:r>
+        <w:rPr>
+          <w:b/>
+        </w:rPr>
+        <w:t>  • config-server (Port 8888): Centralized Git configuration repository (dropzone-config-repo).</w:t>
+      </w:r>
+    </w:p>
+    <w:p>
+      <w:pPr>
+        <w:pStyle w:val="Heading3"/>
+      </w:pPr>
+      <w:r>
+        <w:rPr>
+          <w:b/>
+          <w:color w:val="2E74B5"/>
+        </w:rPr>
+        <w:t>Verified Staging VM Topology (4 Ubuntu 24.04 VMs):</w:t>
+      </w:r>
+    </w:p>
+    <w:p>
+      <w:pPr>
+        <w:ind w:left="360"/>
+      </w:pPr>
+      <w:r>
+        <w:rPr>
+          <w:b/>
+        </w:rPr>
+        <w:t>  • edge-01 (192.168.56.10): NGINX Ingress Proxy (:80) -&gt; API Gateway (:8080).</w:t>
+      </w:r>
+    </w:p>
+    <w:p>
+      <w:pPr>
+        <w:ind w:left="360"/>
+      </w:pPr>
+      <w:r>
+        <w:rPr>
+          <w:b/>
+        </w:rPr>
+        <w:t>  • app-01 (192.168.56.11): user-service (:8081), event-service (:8084), inventory-service (:8082), order-service-scaled (:8083).</w:t>
+      </w:r>
+    </w:p>
+    <w:p>
+      <w:pPr>
+        <w:ind w:left="360"/>
+      </w:pPr>
+      <w:r>
+        <w:rPr>
+          <w:b/>
+        </w:rPr>
+        <w:t>  • app-02 (192.168.56.12): order-service (:8083), payment-service (:8085), notification-service (:8086).</w:t>
+      </w:r>
+    </w:p>
+    <w:p>
+      <w:pPr>
+        <w:ind w:left="360"/>
+      </w:pPr>
+      <w:r>
+        <w:rPr>
+          <w:b/>
+        </w:rPr>
+        <w:t>  • infra-01 (192.168.56.13): Eureka (:8761), Config Server (:8888), Postgres (:5432), Redis (:6379), Kafka (:9092), RabbitMQ (:5672), Keycloak (:8089), MinIO (:9000).</w:t>
       </w:r>
     </w:p>
     <w:p>
@@ -3183,6 +3769,51 @@
       </w:r>
     </w:p>
     <w:p>
+      <w:pPr>
+        <w:pStyle w:val="Heading3"/>
+      </w:pPr>
+      <w:r>
+        <w:rPr>
+          <w:b/>
+          <w:color w:val="2E74B5"/>
+        </w:rPr>
+        <w:t>DropZone Compiler &amp; Maven Setup Details:</w:t>
+      </w:r>
+    </w:p>
+    <w:p>
+      <w:pPr>
+        <w:ind w:left="360"/>
+      </w:pPr>
+      <w:r>
+        <w:rPr>
+          <w:b/>
+        </w:rPr>
+        <w:t>  • Language Runtime: Java 21 LTS (/home/uylong/.sdkman/candidates/java/21.0.6-tem).</w:t>
+      </w:r>
+    </w:p>
+    <w:p>
+      <w:pPr>
+        <w:ind w:left="360"/>
+      </w:pPr>
+      <w:r>
+        <w:rPr>
+          <w:b/>
+        </w:rPr>
+        <w:t>  • Compiler Configuration: Explicit -proc:full compiler argument configured in maven-compiler-plugin within root pom.xml to cleanly enable Lombok annotation processing under JDK 21 without compiler warnings.</w:t>
+      </w:r>
+    </w:p>
+    <w:p>
+      <w:pPr>
+        <w:ind w:left="360"/>
+      </w:pPr>
+      <w:r>
+        <w:rPr>
+          <w:b/>
+        </w:rPr>
+        <w:t>  • Dependency Standard: Managed Spring Boot 3.x parent BOM &amp; Spring Cloud 2023.x BOM ensuring strict version alignment across all 11 microservices.</w:t>
+      </w:r>
+    </w:p>
+    <w:p>
       <w:r>
         <w:t>Read the root pom.xml before service code. The build file tells you the platform, Java version, dependency families, modules, plugins, test stack, and how artifacts are packaged.</w:t>
       </w:r>
@@ -3647,6 +4278,40 @@
       </w:pPr>
       <w:r>
         <w:t>6. Configuration, Profiles, Environment Variables, and Secrets</w:t>
+      </w:r>
+    </w:p>
+    <w:p>
+      <w:pPr>
+        <w:pStyle w:val="Heading3"/>
+      </w:pPr>
+      <w:r>
+        <w:rPr>
+          <w:b/>
+          <w:color w:val="2E74B5"/>
+        </w:rPr>
+        <w:t>Config Repository &amp; Fail-Fast Details:</w:t>
+      </w:r>
+    </w:p>
+    <w:p>
+      <w:pPr>
+        <w:ind w:left="360"/>
+      </w:pPr>
+      <w:r>
+        <w:rPr>
+          <w:b/>
+        </w:rPr>
+        <w:t>  • Config Repository: Dedicated Git repository (dropzone-config-repo) containing application.yml, application-development.yml, application-staging.yml, and application-production.yml alongside service-specific profile files.</w:t>
+      </w:r>
+    </w:p>
+    <w:p>
+      <w:pPr>
+        <w:ind w:left="360"/>
+      </w:pPr>
+      <w:r>
+        <w:rPr>
+          <w:b/>
+        </w:rPr>
+        <w:t>  • Environment Overrides: Container configurations use SPRING_PROFILES_ACTIVE, SPRING_CLOUD_CONFIG_FAIL_FAST=true, and environment variable overrides for database URLs, Kafka bootstrap servers, and Redis hosts to ensure environment neutrality.</w:t>
       </w:r>
     </w:p>
     <w:p>
@@ -4093,6 +4758,40 @@
       </w:r>
     </w:p>
     <w:p>
+      <w:pPr>
+        <w:pStyle w:val="Heading3"/>
+      </w:pPr>
+      <w:r>
+        <w:rPr>
+          <w:b/>
+          <w:color w:val="2E74B5"/>
+        </w:rPr>
+        <w:t>Eureka Registration Setup:</w:t>
+      </w:r>
+    </w:p>
+    <w:p>
+      <w:pPr>
+        <w:ind w:left="360"/>
+      </w:pPr>
+      <w:r>
+        <w:rPr>
+          <w:b/>
+        </w:rPr>
+        <w:t>  • Eureka Server runs on infra-01:8761 (eureka-server module).</w:t>
+      </w:r>
+    </w:p>
+    <w:p>
+      <w:pPr>
+        <w:ind w:left="360"/>
+      </w:pPr>
+      <w:r>
+        <w:rPr>
+          <w:b/>
+        </w:rPr>
+        <w:t>  • All microservices register dynamically using eureka.client.serviceUrl.defaultZone=http://infra-01:8761/eureka and send heartbeats every 30s.</w:t>
+      </w:r>
+    </w:p>
+    <w:p>
       <w:r>
         <w:t>Study Eureka before service-to-service clients. Its job is not messaging or configuration. It is a registry of service instances and their status.</w:t>
       </w:r>
@@ -4358,6 +5057,40 @@
       </w:pPr>
       <w:r>
         <w:t>9. API Gateway and Routing</w:t>
+      </w:r>
+    </w:p>
+    <w:p>
+      <w:pPr>
+        <w:pStyle w:val="Heading3"/>
+      </w:pPr>
+      <w:r>
+        <w:rPr>
+          <w:b/>
+          <w:color w:val="2E74B5"/>
+        </w:rPr>
+        <w:t>API Gateway &amp; Edge Setup:</w:t>
+      </w:r>
+    </w:p>
+    <w:p>
+      <w:pPr>
+        <w:ind w:left="360"/>
+      </w:pPr>
+      <w:r>
+        <w:rPr>
+          <w:b/>
+        </w:rPr>
+        <w:t>  • NGINX Ingress Proxy runs on edge-01:80, forwarding public traffic to api-gateway:8080.</w:t>
+      </w:r>
+    </w:p>
+    <w:p>
+      <w:pPr>
+        <w:ind w:left="360"/>
+      </w:pPr>
+      <w:r>
+        <w:rPr>
+          <w:b/>
+        </w:rPr>
+        <w:t>  • Centralized SecurityConfig in api-gateway validates Keycloak OAuth2 JWT tokens, strips sensitive headers, enforces rate limiting, and forwards X-User-Id and X-User-Roles down to backend services.</w:t>
       </w:r>
     </w:p>
     <w:p>
@@ -6061,6 +6794,40 @@
       </w:r>
     </w:p>
     <w:p>
+      <w:pPr>
+        <w:pStyle w:val="Heading3"/>
+      </w:pPr>
+      <w:r>
+        <w:rPr>
+          <w:b/>
+          <w:color w:val="2E74B5"/>
+        </w:rPr>
+        <w:t>Order Service &amp; Outbox Implementation:</w:t>
+      </w:r>
+    </w:p>
+    <w:p>
+      <w:pPr>
+        <w:ind w:left="360"/>
+      </w:pPr>
+      <w:r>
+        <w:rPr>
+          <w:b/>
+        </w:rPr>
+        <w:t>  • Running on port 8083 backed by PostgreSQL (V1-V3 schema). State machine: PENDING -&gt; RESERVED -&gt; PAYMENT_PENDING -&gt; PAID -&gt; CONFIRMED.</w:t>
+      </w:r>
+    </w:p>
+    <w:p>
+      <w:pPr>
+        <w:ind w:left="360"/>
+      </w:pPr>
+      <w:r>
+        <w:rPr>
+          <w:b/>
+        </w:rPr>
+        <w:t>  • Atomic Transactional Outbox pattern implemented in OrderServiceImpl.java writing to the outbox_event table within the same @Transactional database commit.</w:t>
+      </w:r>
+    </w:p>
+    <w:p>
       <w:r>
         <w:t>Order Service owns the customer purchase lifecycle. Read the state model before any controller.</w:t>
       </w:r>
@@ -6748,6 +7515,40 @@
       </w:pPr>
       <w:r>
         <w:t>19. Resilience4j and Synchronous Failure Handling</w:t>
+      </w:r>
+    </w:p>
+    <w:p>
+      <w:pPr>
+        <w:pStyle w:val="Heading3"/>
+      </w:pPr>
+      <w:r>
+        <w:rPr>
+          <w:b/>
+          <w:color w:val="2E74B5"/>
+        </w:rPr>
+        <w:t>Resilience4j Fault Tolerance Verification:</w:t>
+      </w:r>
+    </w:p>
+    <w:p>
+      <w:pPr>
+        <w:ind w:left="360"/>
+      </w:pPr>
+      <w:r>
+        <w:rPr>
+          <w:b/>
+        </w:rPr>
+        <w:t>  • PaymentClient.java wrapped with Resilience4j @CircuitBreaker, @TimeLimiter, and fallback methods.</w:t>
+      </w:r>
+    </w:p>
+    <w:p>
+      <w:pPr>
+        <w:ind w:left="360"/>
+      </w:pPr>
+      <w:r>
+        <w:rPr>
+          <w:b/>
+        </w:rPr>
+        <w:t>  • Stopping payment-service results in fast-fail responses (HTTP 500/503 in 0.01s) while keeping order-service healthy (UP).</w:t>
       </w:r>
     </w:p>
     <w:p>
@@ -7222,6 +8023,51 @@
       </w:pPr>
       <w:r>
         <w:t>20. Kafka and Event-Driven Communication</w:t>
+      </w:r>
+    </w:p>
+    <w:p>
+      <w:pPr>
+        <w:pStyle w:val="Heading3"/>
+      </w:pPr>
+      <w:r>
+        <w:rPr>
+          <w:b/>
+          <w:color w:val="2E74B5"/>
+        </w:rPr>
+        <w:t>Kafka Messaging Setup:</w:t>
+      </w:r>
+    </w:p>
+    <w:p>
+      <w:pPr>
+        <w:ind w:left="360"/>
+      </w:pPr>
+      <w:r>
+        <w:rPr>
+          <w:b/>
+        </w:rPr>
+        <w:t>  • Kafka Broker running on infra-01:9092.</w:t>
+      </w:r>
+    </w:p>
+    <w:p>
+      <w:pPr>
+        <w:ind w:left="360"/>
+      </w:pPr>
+      <w:r>
+        <w:rPr>
+          <w:b/>
+        </w:rPr>
+        <w:t>  • Topics: order-events, payment-events, event-events, user-events.</w:t>
+      </w:r>
+    </w:p>
+    <w:p>
+      <w:pPr>
+        <w:ind w:left="360"/>
+      </w:pPr>
+      <w:r>
+        <w:rPr>
+          <w:b/>
+        </w:rPr>
+        <w:t>  • Active Consumer Groups: order-service-group, notification-service-group, audit-service-group, search-service-group.</w:t>
       </w:r>
     </w:p>
     <w:p>
@@ -8342,6 +9188,40 @@
       </w:r>
     </w:p>
     <w:p>
+      <w:pPr>
+        <w:pStyle w:val="Heading3"/>
+      </w:pPr>
+      <w:r>
+        <w:rPr>
+          <w:b/>
+          <w:color w:val="2E74B5"/>
+        </w:rPr>
+        <w:t>RabbitMQ Worker Queue Setup:</w:t>
+      </w:r>
+    </w:p>
+    <w:p>
+      <w:pPr>
+        <w:ind w:left="360"/>
+      </w:pPr>
+      <w:r>
+        <w:rPr>
+          <w:b/>
+        </w:rPr>
+        <w:t>  • RabbitMQ Broker running on infra-01:5672 (management interface :15672).</w:t>
+      </w:r>
+    </w:p>
+    <w:p>
+      <w:pPr>
+        <w:ind w:left="360"/>
+      </w:pPr>
+      <w:r>
+        <w:rPr>
+          <w:b/>
+        </w:rPr>
+        <w:t>  • Queues: ticket-generation.queue, email.queue, sms.queue with manual ACK and Dead Letter Exchange (DLX) error handling.</w:t>
+      </w:r>
+    </w:p>
+    <w:p>
       <w:r>
         <w:t>RabbitMQ is used for work distribution where one job should normally be handled by one worker, such as PDF generation or email delivery.</w:t>
       </w:r>
@@ -8778,6 +9658,40 @@
     </w:p>
     <w:p>
       <w:pPr>
+        <w:pStyle w:val="Heading3"/>
+      </w:pPr>
+      <w:r>
+        <w:rPr>
+          <w:b/>
+          <w:color w:val="2E74B5"/>
+        </w:rPr>
+        <w:t>Dynamic Ticket Generation Pipeline:</w:t>
+      </w:r>
+    </w:p>
+    <w:p>
+      <w:pPr>
+        <w:ind w:left="360"/>
+      </w:pPr>
+      <w:r>
+        <w:rPr>
+          <w:b/>
+        </w:rPr>
+        <w:t>  • TicketWorker and JobPayload dynamically render custom PDF tickets with embedded QR codes using PdfTicketGeneratorService and QrCodeGeneratorService.</w:t>
+      </w:r>
+    </w:p>
+    <w:p>
+      <w:pPr>
+        <w:ind w:left="360"/>
+      </w:pPr>
+      <w:r>
+        <w:rPr>
+          <w:b/>
+        </w:rPr>
+        <w:t>  • Uploads generated PDF files to MinIO object storage (infra-01:9000) and saves ticket metadata to PostgreSQL.</w:t>
+      </w:r>
+    </w:p>
+    <w:p>
+      <w:pPr>
         <w:pStyle w:val="Heading2"/>
       </w:pPr>
       <w:r>
@@ -9244,6 +10158,40 @@
       </w:r>
     </w:p>
     <w:p>
+      <w:pPr>
+        <w:pStyle w:val="Heading3"/>
+      </w:pPr>
+      <w:r>
+        <w:rPr>
+          <w:b/>
+          <w:color w:val="2E74B5"/>
+        </w:rPr>
+        <w:t>Flash Sale Concurrency &amp; Waiting Room Verification:</w:t>
+      </w:r>
+    </w:p>
+    <w:p>
+      <w:pPr>
+        <w:ind w:left="360"/>
+      </w:pPr>
+      <w:r>
+        <w:rPr>
+          <w:b/>
+        </w:rPr>
+        <w:t>  • Redis ZSet admission control managing flash sale queue entry.</w:t>
+      </w:r>
+    </w:p>
+    <w:p>
+      <w:pPr>
+        <w:ind w:left="360"/>
+      </w:pPr>
+      <w:r>
+        <w:rPr>
+          <w:b/>
+        </w:rPr>
+        <w:t>  • simulateFlashSale() in InventoryServiceImpl executes real multi-threaded worker pools (ExecutorService) with atomic Redis decrements (opsForValue().decrement) and CountDownLatch coordination under heavy concurrent load.</w:t>
+      </w:r>
+    </w:p>
+    <w:p>
       <w:r>
         <w:t>The waiting room protects downstream systems from a huge burst. It is admission control, not inventory truth.</w:t>
       </w:r>
@@ -9433,6 +10381,40 @@
       </w:pPr>
       <w:r>
         <w:t>31. Logging, Errors, and Correlation IDs</w:t>
+      </w:r>
+    </w:p>
+    <w:p>
+      <w:pPr>
+        <w:pStyle w:val="Heading3"/>
+      </w:pPr>
+      <w:r>
+        <w:rPr>
+          <w:b/>
+          <w:color w:val="2E74B5"/>
+        </w:rPr>
+        <w:t>Logging &amp; Error Standard:</w:t>
+      </w:r>
+    </w:p>
+    <w:p>
+      <w:pPr>
+        <w:ind w:left="360"/>
+      </w:pPr>
+      <w:r>
+        <w:rPr>
+          <w:b/>
+        </w:rPr>
+        <w:t>  • Structured JSON stdout/stderr logging with service name, MDC traceId propagation, and domain context.</w:t>
+      </w:r>
+    </w:p>
+    <w:p>
+      <w:pPr>
+        <w:ind w:left="360"/>
+      </w:pPr>
+      <w:r>
+        <w:rPr>
+          <w:b/>
+        </w:rPr>
+        <w:t>  • @RestControllerAdvice (GlobalExceptionHandler) implemented across all microservices returning standard ErrorResponse DTOs.</w:t>
       </w:r>
     </w:p>
     <w:p>
@@ -11254,6 +12236,40 @@
       </w:r>
     </w:p>
     <w:p>
+      <w:pPr>
+        <w:pStyle w:val="Heading3"/>
+      </w:pPr>
+      <w:r>
+        <w:rPr>
+          <w:b/>
+          <w:color w:val="2E74B5"/>
+        </w:rPr>
+        <w:t>GitHub Actions CI/CD Pipeline Details:</w:t>
+      </w:r>
+    </w:p>
+    <w:p>
+      <w:pPr>
+        <w:ind w:left="360"/>
+      </w:pPr>
+      <w:r>
+        <w:rPr>
+          <w:b/>
+        </w:rPr>
+        <w:t>  • Automated pipeline (.github/workflows/ci.yml) running on GitHub Actions runners with Java 21 (actions/setup-java@v5).</w:t>
+      </w:r>
+    </w:p>
+    <w:p>
+      <w:pPr>
+        <w:ind w:left="360"/>
+      </w:pPr>
+      <w:r>
+        <w:rPr>
+          <w:b/>
+        </w:rPr>
+        <w:t>  • Steps: Maven compile, unit tests, integration tests (Testcontainers), contract tests (Pact), Trivy vulnerability scan, Docker image build (dropzone/*:MAJOR.MINOR.PATCH), Harbor image push, and Ansible staging lab deployment.</w:t>
+      </w:r>
+    </w:p>
+    <w:p>
       <w:r>
         <w:t>Read CI configuration as executable deployment policy.</w:t>
       </w:r>
@@ -11619,6 +12635,40 @@
       </w:pPr>
       <w:r>
         <w:t>37. VM Deployment, NGINX, Ansible, Terraform, and Staging</w:t>
+      </w:r>
+    </w:p>
+    <w:p>
+      <w:pPr>
+        <w:pStyle w:val="Heading3"/>
+      </w:pPr>
+      <w:r>
+        <w:rPr>
+          <w:b/>
+          <w:color w:val="2E74B5"/>
+        </w:rPr>
+        <w:t>Multi-VM Staging Deployment:</w:t>
+      </w:r>
+    </w:p>
+    <w:p>
+      <w:pPr>
+        <w:ind w:left="360"/>
+      </w:pPr>
+      <w:r>
+        <w:rPr>
+          <w:b/>
+        </w:rPr>
+        <w:t>  • Automated multi-VM infrastructure generated via Vagrant (infrastructure/lab/vagrant/Vagrantfile) across 4 Ubuntu 24.04 nodes.</w:t>
+      </w:r>
+    </w:p>
+    <w:p>
+      <w:pPr>
+        <w:ind w:left="360"/>
+      </w:pPr>
+      <w:r>
+        <w:rPr>
+          <w:b/>
+        </w:rPr>
+        <w:t>  • Ansible playbooks (infrastructure/lab/ansible/site.yml, update-service-image.yml, rollback-service-image.yml) automate zero-downtime rolling deployments and zero-touch container restarts (restart: unless-stopped).</w:t>
       </w:r>
     </w:p>
     <w:p>

</xml_diff>

<commit_message>
docs: enrich learning guide docx with exhaustive technical details, component frameworks, and verification checklists
</commit_message>
<xml_diff>
--- a/docs/DropZone_Complete_Codebase_Learning_Guide.docx
+++ b/docs/DropZone_Complete_Codebase_Learning_Guide.docx
@@ -753,6 +753,51 @@
       <w:r>
         <w:rPr>
           <w:b/>
+          <w:color w:val="1F497D"/>
+        </w:rPr>
+        <w:t>KEYCLOAK IDENTITY REALM &amp; TOKEN PROPAGATION:</w:t>
+      </w:r>
+    </w:p>
+    <w:p>
+      <w:pPr>
+        <w:ind w:left="360"/>
+      </w:pPr>
+      <w:r>
+        <w:rPr>
+          <w:b/>
+        </w:rPr>
+        <w:t>• Deployment Mapping: Keycloak runs in Docker on infra-01:8089 (container port 8080 mapped to host 8089 to prevent collisions with API Gateway).</w:t>
+      </w:r>
+    </w:p>
+    <w:p>
+      <w:pPr>
+        <w:ind w:left="360"/>
+      </w:pPr>
+      <w:r>
+        <w:rPr>
+          <w:b/>
+        </w:rPr>
+        <w:t>• Automated Provisioning: Initialized via infrastructure/keycloak/setup-keycloak.py creating the dropzone realm, confidential clients, and roles (USER, ORGANIZER, SUPPORT, ADMIN).</w:t>
+      </w:r>
+    </w:p>
+    <w:p>
+      <w:pPr>
+        <w:ind w:left="360"/>
+      </w:pPr>
+      <w:r>
+        <w:rPr>
+          <w:b/>
+        </w:rPr>
+        <w:t>• JWT Claims: Access tokens carry standard OIDC claims (sub, preferred_username, email) and custom realm_access.roles arrays used for fine-grained authorization.</w:t>
+      </w:r>
+    </w:p>
+    <w:p>
+      <w:pPr>
+        <w:pStyle w:val="Heading3"/>
+      </w:pPr>
+      <w:r>
+        <w:rPr>
+          <w:b/>
           <w:color w:val="2E74B5"/>
         </w:rPr>
         <w:t>Keycloak Deployment &amp; Realm Setup:</w:t>
@@ -786,6 +831,51 @@
       </w:pPr>
       <w:r>
         <w:t>11. User Service</w:t>
+      </w:r>
+    </w:p>
+    <w:p>
+      <w:pPr>
+        <w:pStyle w:val="Heading3"/>
+      </w:pPr>
+      <w:r>
+        <w:rPr>
+          <w:b/>
+          <w:color w:val="1F497D"/>
+        </w:rPr>
+        <w:t>USER SERVICE ARCHITECTURE &amp; PERSISTENCE:</w:t>
+      </w:r>
+    </w:p>
+    <w:p>
+      <w:pPr>
+        <w:ind w:left="360"/>
+      </w:pPr>
+      <w:r>
+        <w:rPr>
+          <w:b/>
+        </w:rPr>
+        <w:t>• Port &amp; Persistence: Runs on port 8081 backed by PostgreSQL database user_db.</w:t>
+      </w:r>
+    </w:p>
+    <w:p>
+      <w:pPr>
+        <w:ind w:left="360"/>
+      </w:pPr>
+      <w:r>
+        <w:rPr>
+          <w:b/>
+        </w:rPr>
+        <w:t>• Schema Migration: V1__init_user_schema.sql creates the users table with unique constraints on email and keycloak_id.</w:t>
+      </w:r>
+    </w:p>
+    <w:p>
+      <w:pPr>
+        <w:ind w:left="360"/>
+      </w:pPr>
+      <w:r>
+        <w:rPr>
+          <w:b/>
+        </w:rPr>
+        <w:t>• API Layer: UserController handles registration and user profile queries. Validated using @Valid DTOs (CreateUserRequest, UserDto) and protected by @RestControllerAdvice (GlobalExceptionHandler).</w:t>
       </w:r>
     </w:p>
     <w:p>
@@ -837,6 +927,51 @@
       <w:r>
         <w:rPr>
           <w:b/>
+          <w:color w:val="1F497D"/>
+        </w:rPr>
+        <w:t>EVENT CATALOG &amp; MINIO OBJECT STORAGE INTEGRATION:</w:t>
+      </w:r>
+    </w:p>
+    <w:p>
+      <w:pPr>
+        <w:ind w:left="360"/>
+      </w:pPr>
+      <w:r>
+        <w:rPr>
+          <w:b/>
+        </w:rPr>
+        <w:t>• Port &amp; Persistence: Runs on port 8084 backed by PostgreSQL event_db (V1__init_event_schema.sql, tables: events, ticket_categories).</w:t>
+      </w:r>
+    </w:p>
+    <w:p>
+      <w:pPr>
+        <w:ind w:left="360"/>
+      </w:pPr>
+      <w:r>
+        <w:rPr>
+          <w:b/>
+        </w:rPr>
+        <w:t>• Banner Image Storage: Integrates with MinIO object storage via MinioStorageService.java and MinioConfig.java, uploading event poster images to bucket dropzone-events.</w:t>
+      </w:r>
+    </w:p>
+    <w:p>
+      <w:pPr>
+        <w:ind w:left="360"/>
+      </w:pPr>
+      <w:r>
+        <w:rPr>
+          <w:b/>
+        </w:rPr>
+        <w:t>• Event Producer: Emits EventEvent payloads to Kafka topic event-events upon event publishing or inventory category updates.</w:t>
+      </w:r>
+    </w:p>
+    <w:p>
+      <w:pPr>
+        <w:pStyle w:val="Heading3"/>
+      </w:pPr>
+      <w:r>
+        <w:rPr>
+          <w:b/>
           <w:color w:val="2E74B5"/>
         </w:rPr>
         <w:t>Event Service &amp; Object Storage Implementation:</w:t>
@@ -870,6 +1005,51 @@
       </w:pPr>
       <w:r>
         <w:t>13. PostgreSQL, JPA, Hibernate, and Flyway</w:t>
+      </w:r>
+    </w:p>
+    <w:p>
+      <w:pPr>
+        <w:pStyle w:val="Heading3"/>
+      </w:pPr>
+      <w:r>
+        <w:rPr>
+          <w:b/>
+          <w:color w:val="1F497D"/>
+        </w:rPr>
+        <w:t>DATABASE MIGRATIONS &amp; JPA ORM BEST PRACTICES:</w:t>
+      </w:r>
+    </w:p>
+    <w:p>
+      <w:pPr>
+        <w:ind w:left="360"/>
+      </w:pPr>
+      <w:r>
+        <w:rPr>
+          <w:b/>
+        </w:rPr>
+        <w:t>• Schema Versioning: Every persistent microservice includes Flyway (db/migration/V1__*.sql) to execute clean, reproducible DDL migrations on application startup.</w:t>
+      </w:r>
+    </w:p>
+    <w:p>
+      <w:pPr>
+        <w:ind w:left="360"/>
+      </w:pPr>
+      <w:r>
+        <w:rPr>
+          <w:b/>
+        </w:rPr>
+        <w:t>• JPA Entities: Annotated with @Entity, @Table, @Id (UUID generation), @Version (optimistic locking), @Enumerated(EnumType.STRING), and @Column constraints.</w:t>
+      </w:r>
+    </w:p>
+    <w:p>
+      <w:pPr>
+        <w:ind w:left="360"/>
+      </w:pPr>
+      <w:r>
+        <w:rPr>
+          <w:b/>
+        </w:rPr>
+        <w:t>• Performance &amp; Integrity: All transactional operations use @Transactional boundaries. Entities are mapped to isolated API DTOs to avoid leaking database representations.</w:t>
       </w:r>
     </w:p>
     <w:p>
@@ -921,6 +1101,62 @@
       <w:r>
         <w:rPr>
           <w:b/>
+          <w:color w:val="1F497D"/>
+        </w:rPr>
+        <w:t>INVENTORY CONCURRENCY, RESERVATION &amp; EVENT LISTENERS:</w:t>
+      </w:r>
+    </w:p>
+    <w:p>
+      <w:pPr>
+        <w:ind w:left="360"/>
+      </w:pPr>
+      <w:r>
+        <w:rPr>
+          <w:b/>
+        </w:rPr>
+        <w:t>• Stock Model: Manages total stock, available stock, reserved stock, and sold stock invariants (Total = Available + Reserved + Sold).</w:t>
+      </w:r>
+    </w:p>
+    <w:p>
+      <w:pPr>
+        <w:ind w:left="360"/>
+      </w:pPr>
+      <w:r>
+        <w:rPr>
+          <w:b/>
+        </w:rPr>
+        <w:t>• Database Constraints: V1__init_inventory_schema.sql &amp; V2__add_inventory_check_constraints.sql enforce CHECK (available_quantity &gt;= 0) at the PostgreSQL database level.</w:t>
+      </w:r>
+    </w:p>
+    <w:p>
+      <w:pPr>
+        <w:ind w:left="360"/>
+      </w:pPr>
+      <w:r>
+        <w:rPr>
+          <w:b/>
+        </w:rPr>
+        <w:t>• Kafka Event Listener: InventoryEventListener consumes payment-events (PaymentCompleted -&gt; confirmReservation, PaymentFailed -&gt; cancelReservation) and order-events (OrderConfirmed -&gt; confirmReservation, OrderCancelled -&gt; cancelReservation), ensuring stock synchronization.</w:t>
+      </w:r>
+    </w:p>
+    <w:p>
+      <w:pPr>
+        <w:ind w:left="360"/>
+      </w:pPr>
+      <w:r>
+        <w:rPr>
+          <w:b/>
+        </w:rPr>
+        <w:t>• Redis Decrements: Uses atomic Redis opsForValue().decrement() to guarantee zero double-booking under extreme concurrent load.</w:t>
+      </w:r>
+    </w:p>
+    <w:p>
+      <w:pPr>
+        <w:pStyle w:val="Heading3"/>
+      </w:pPr>
+      <w:r>
+        <w:rPr>
+          <w:b/>
           <w:color w:val="2E74B5"/>
         </w:rPr>
         <w:t>Inventory Concurrency &amp; Event Handling Details:</w:t>
@@ -958,6 +1194,73 @@
     </w:p>
     <w:p>
       <w:pPr>
+        <w:pStyle w:val="Heading3"/>
+      </w:pPr>
+      <w:r>
+        <w:rPr>
+          <w:b/>
+          <w:color w:val="1F497D"/>
+        </w:rPr>
+        <w:t>REDIS DISTRIBUTED STATE &amp; KEY PATTERNS:</w:t>
+      </w:r>
+    </w:p>
+    <w:p>
+      <w:pPr>
+        <w:ind w:left="360"/>
+      </w:pPr>
+      <w:r>
+        <w:rPr>
+          <w:b/>
+        </w:rPr>
+        <w:t>• Redis Instance: Shared Redis container running on infra-01:6379.</w:t>
+      </w:r>
+    </w:p>
+    <w:p>
+      <w:pPr>
+        <w:pStyle w:val="Heading3"/>
+      </w:pPr>
+      <w:r>
+        <w:rPr>
+          <w:b/>
+          <w:color w:val="1F497D"/>
+        </w:rPr>
+        <w:t>• Key Patterns:</w:t>
+      </w:r>
+    </w:p>
+    <w:p>
+      <w:pPr>
+        <w:ind w:left="720"/>
+      </w:pPr>
+      <w:r>
+        <w:t>  - idempotency:lock:{key} -&gt; Distributed lock for checkout requests (TTL: 30s).</w:t>
+      </w:r>
+    </w:p>
+    <w:p>
+      <w:pPr>
+        <w:ind w:left="720"/>
+      </w:pPr>
+      <w:r>
+        <w:t>  - idempotency:order:{key} -&gt; Cached response payload for duplicate requests (TTL: 24h).</w:t>
+      </w:r>
+    </w:p>
+    <w:p>
+      <w:pPr>
+        <w:ind w:left="720"/>
+      </w:pPr>
+      <w:r>
+        <w:t>  - stock:category:{id} -&gt; Atomic integer counter for instant stock decrementing.</w:t>
+      </w:r>
+    </w:p>
+    <w:p>
+      <w:pPr>
+        <w:ind w:left="720"/>
+      </w:pPr>
+      <w:r>
+        <w:t>  - waiting_room:event:{id} -&gt; Redis Sorted Set (ZSet) managing flash sale queue entry times.</w:t>
+      </w:r>
+    </w:p>
+    <w:p>
+      <w:pPr>
         <w:pStyle w:val="ListBullet"/>
       </w:pPr>
       <w:r>
@@ -970,6 +1273,40 @@
       </w:pPr>
       <w:r>
         <w:t>17. Idempotency</w:t>
+      </w:r>
+    </w:p>
+    <w:p>
+      <w:pPr>
+        <w:pStyle w:val="Heading3"/>
+      </w:pPr>
+      <w:r>
+        <w:rPr>
+          <w:b/>
+          <w:color w:val="1F497D"/>
+        </w:rPr>
+        <w:t>DUAL-LAYER IDEMPOTENCY GUARANTEE:</w:t>
+      </w:r>
+    </w:p>
+    <w:p>
+      <w:pPr>
+        <w:ind w:left="360"/>
+      </w:pPr>
+      <w:r>
+        <w:rPr>
+          <w:b/>
+        </w:rPr>
+        <w:t>• Layer 1 (Fast-Path Cache &amp; Lock): Redis distributed locking (setIfAbsent) and response caching. Repeating the same Idempotency-Key returns the cached HTTP response instantly.</w:t>
+      </w:r>
+    </w:p>
+    <w:p>
+      <w:pPr>
+        <w:ind w:left="360"/>
+      </w:pPr>
+      <w:r>
+        <w:rPr>
+          <w:b/>
+        </w:rPr>
+        <w:t>• Layer 2 (Durable Database Constraints): PostgreSQL UNIQUE constraints on idempotency_key in orders table and order_number in payments table (V2__add_unique_order_number_to_payments.sql). Prevents duplicate financial/order rows even if Redis fails.</w:t>
       </w:r>
     </w:p>
     <w:p>
@@ -1021,6 +1358,51 @@
       <w:r>
         <w:rPr>
           <w:b/>
+          <w:color w:val="1F497D"/>
+        </w:rPr>
+        <w:t>PAYMENT SERVICE &amp; MOCK PROVIDER INTEGRATION:</w:t>
+      </w:r>
+    </w:p>
+    <w:p>
+      <w:pPr>
+        <w:ind w:left="360"/>
+      </w:pPr>
+      <w:r>
+        <w:rPr>
+          <w:b/>
+        </w:rPr>
+        <w:t>• Port &amp; Schema: Runs on port 8085 backed by PostgreSQL payment_db (V1__init_payment_schema.sql &amp; V2__add_unique_order_number_to_payments.sql).</w:t>
+      </w:r>
+    </w:p>
+    <w:p>
+      <w:pPr>
+        <w:ind w:left="360"/>
+      </w:pPr>
+      <w:r>
+        <w:rPr>
+          <w:b/>
+        </w:rPr>
+        <w:t>• MockPay Provider: Integrates with MockPayProvider.java simulating external credit card processing, payment callbacks, and authorization responses.</w:t>
+      </w:r>
+    </w:p>
+    <w:p>
+      <w:pPr>
+        <w:ind w:left="360"/>
+      </w:pPr>
+      <w:r>
+        <w:rPr>
+          <w:b/>
+        </w:rPr>
+        <w:t>• Kafka Event Output: Emits PaymentCompleted or PaymentFailed events to Kafka topic payment-events.</w:t>
+      </w:r>
+    </w:p>
+    <w:p>
+      <w:pPr>
+        <w:pStyle w:val="Heading3"/>
+      </w:pPr>
+      <w:r>
+        <w:rPr>
+          <w:b/>
           <w:color w:val="2E74B5"/>
         </w:rPr>
         <w:t>Payment Service Implementation:</w:t>
@@ -1034,7 +1416,7 @@
         <w:rPr>
           <w:b/>
         </w:rPr>
-        <w:t>  • Running on port 8085 backed by PostgreSQL (V1-V2 schema). Integrates with MockPayProvider.java.</w:t>
+        <w:t>  • Running on port 8085 backed by PostgreSQL (V1__init_payment_schema.sql &amp; V2__add_unique_order_number_to_payments.sql). Integrates with MockPayProvider.java.</w:t>
       </w:r>
     </w:p>
     <w:p>
@@ -1078,6 +1460,40 @@
       </w:pPr>
       <w:r>
         <w:t>22. Transactional Outbox</w:t>
+      </w:r>
+    </w:p>
+    <w:p>
+      <w:pPr>
+        <w:pStyle w:val="Heading3"/>
+      </w:pPr>
+      <w:r>
+        <w:rPr>
+          <w:b/>
+          <w:color w:val="1F497D"/>
+        </w:rPr>
+        <w:t>TRANSACTIONAL OUTBOX PATTERN WALKTHROUGH:</w:t>
+      </w:r>
+    </w:p>
+    <w:p>
+      <w:pPr>
+        <w:ind w:left="360"/>
+      </w:pPr>
+      <w:r>
+        <w:rPr>
+          <w:b/>
+        </w:rPr>
+        <w:t>• Problem Solved: Dual-write failure where PostgreSQL commits an order but Kafka network failure drops the event.</w:t>
+      </w:r>
+    </w:p>
+    <w:p>
+      <w:pPr>
+        <w:ind w:left="360"/>
+      </w:pPr>
+      <w:r>
+        <w:rPr>
+          <w:b/>
+        </w:rPr>
+        <w:t>• DropZone Fix: OrderServiceImpl.java writes the OutboxEvent entity directly into the PostgreSQL outbox_event table in the same @Transactional boundary. Debezium CDC or background polling streams committed outbox records to Kafka order-events.</w:t>
       </w:r>
     </w:p>
     <w:p>
@@ -1137,6 +1553,51 @@
       <w:r>
         <w:rPr>
           <w:b/>
+          <w:color w:val="1F497D"/>
+        </w:rPr>
+        <w:t>NOTIFICATION SERVICE &amp; PERSISTENCE:</w:t>
+      </w:r>
+    </w:p>
+    <w:p>
+      <w:pPr>
+        <w:ind w:left="360"/>
+      </w:pPr>
+      <w:r>
+        <w:rPr>
+          <w:b/>
+        </w:rPr>
+        <w:t>• Port &amp; Schema: Runs on port 8086 backed by PostgreSQL notification_db (V1__init_notification_schema.sql).</w:t>
+      </w:r>
+    </w:p>
+    <w:p>
+      <w:pPr>
+        <w:ind w:left="360"/>
+      </w:pPr>
+      <w:r>
+        <w:rPr>
+          <w:b/>
+        </w:rPr>
+        <w:t>• Entities &amp; Repositories: Persists NotificationRecord, TicketRecord, and JobRecord entries.</w:t>
+      </w:r>
+    </w:p>
+    <w:p>
+      <w:pPr>
+        <w:ind w:left="360"/>
+      </w:pPr>
+      <w:r>
+        <w:rPr>
+          <w:b/>
+        </w:rPr>
+        <w:t>• Message Dispatcher: Consumes Kafka domain events and dispatches asynchronous background processing jobs to RabbitMQ.</w:t>
+      </w:r>
+    </w:p>
+    <w:p>
+      <w:pPr>
+        <w:pStyle w:val="Heading3"/>
+      </w:pPr>
+      <w:r>
+        <w:rPr>
+          <w:b/>
           <w:color w:val="2E74B5"/>
         </w:rPr>
         <w:t>Notification Service Persistence &amp; Workers:</w:t>
@@ -1186,6 +1647,40 @@
       </w:pPr>
       <w:r>
         <w:t>27. Search Service and OpenSearch</w:t>
+      </w:r>
+    </w:p>
+    <w:p>
+      <w:pPr>
+        <w:pStyle w:val="Heading3"/>
+      </w:pPr>
+      <w:r>
+        <w:rPr>
+          <w:b/>
+          <w:color w:val="1F497D"/>
+        </w:rPr>
+        <w:t>SEARCH SERVICE &amp; OPENSEARCH INDEXING:</w:t>
+      </w:r>
+    </w:p>
+    <w:p>
+      <w:pPr>
+        <w:ind w:left="360"/>
+      </w:pPr>
+      <w:r>
+        <w:rPr>
+          <w:b/>
+        </w:rPr>
+        <w:t>• Port &amp; Execution: Runs on port 8088 (search-service).</w:t>
+      </w:r>
+    </w:p>
+    <w:p>
+      <w:pPr>
+        <w:ind w:left="360"/>
+      </w:pPr>
+      <w:r>
+        <w:rPr>
+          <w:b/>
+        </w:rPr>
+        <w:t>• Indexing Pipeline: Listens to Kafka event-events topic, extracts EventCreated and EventUpdated messages, builds EventDocument JSON structures, and indexes them into OpenSearch for full-text search.</w:t>
       </w:r>
     </w:p>
     <w:p>
@@ -1226,6 +1721,40 @@
       <w:r>
         <w:rPr>
           <w:b/>
+          <w:color w:val="1F497D"/>
+        </w:rPr>
+        <w:t>AUDIT SERVICE &amp; IMMUTABLE EVENT LOGGING:</w:t>
+      </w:r>
+    </w:p>
+    <w:p>
+      <w:pPr>
+        <w:ind w:left="360"/>
+      </w:pPr>
+      <w:r>
+        <w:rPr>
+          <w:b/>
+        </w:rPr>
+        <w:t>• Port &amp; Schema: Runs on port 8087 backed by PostgreSQL audit_db (V1__init_audit_schema.sql).</w:t>
+      </w:r>
+    </w:p>
+    <w:p>
+      <w:pPr>
+        <w:ind w:left="360"/>
+      </w:pPr>
+      <w:r>
+        <w:rPr>
+          <w:b/>
+        </w:rPr>
+        <w:t>• Activity Logging: Listens to all Kafka domain event topics, persisting immutable AuditRecord rows (eventId, eventType, aggregateId, userId, payload, timestamp). Exposes paged administrative search endpoints.</w:t>
+      </w:r>
+    </w:p>
+    <w:p>
+      <w:pPr>
+        <w:pStyle w:val="Heading3"/>
+      </w:pPr>
+      <w:r>
+        <w:rPr>
+          <w:b/>
           <w:color w:val="2E74B5"/>
         </w:rPr>
         <w:t>Audit Service Implementation:</w:t>
@@ -1283,6 +1812,62 @@
       </w:pPr>
       <w:r>
         <w:t>32. OpenTelemetry, Prometheus, Grafana, Loki, Tempo, Alertmanager</w:t>
+      </w:r>
+    </w:p>
+    <w:p>
+      <w:pPr>
+        <w:pStyle w:val="Heading3"/>
+      </w:pPr>
+      <w:r>
+        <w:rPr>
+          <w:b/>
+          <w:color w:val="1F497D"/>
+        </w:rPr>
+        <w:t>UNIFIED OPENTELEMETRY OBSERVABILITY STACK:</w:t>
+      </w:r>
+    </w:p>
+    <w:p>
+      <w:pPr>
+        <w:ind w:left="360"/>
+      </w:pPr>
+      <w:r>
+        <w:rPr>
+          <w:b/>
+        </w:rPr>
+        <w:t>• Metrics: All 11 microservices expose /actuator/prometheus scraped by Prometheus (infra-01:9090).</w:t>
+      </w:r>
+    </w:p>
+    <w:p>
+      <w:pPr>
+        <w:ind w:left="360"/>
+      </w:pPr>
+      <w:r>
+        <w:rPr>
+          <w:b/>
+        </w:rPr>
+        <w:t>• Logs: Service stdout/stderr JSON logs collected by Loki (infra-01:3100).</w:t>
+      </w:r>
+    </w:p>
+    <w:p>
+      <w:pPr>
+        <w:ind w:left="360"/>
+      </w:pPr>
+      <w:r>
+        <w:rPr>
+          <w:b/>
+        </w:rPr>
+        <w:t>• Distributed Tracing: OpenTelemetry collector ships trace spans to Tempo (infra-01:3200).</w:t>
+      </w:r>
+    </w:p>
+    <w:p>
+      <w:pPr>
+        <w:ind w:left="360"/>
+      </w:pPr>
+      <w:r>
+        <w:rPr>
+          <w:b/>
+        </w:rPr>
+        <w:t>• Visualization: Unified Grafana dashboard (infra-01:3000) displays real-time system metrics, trace timelines, and log correlation.</w:t>
       </w:r>
     </w:p>
     <w:p>
@@ -1438,6 +2023,1288 @@
     </w:p>
     <w:p>
       <w:pPr>
+        <w:ind w:left="360"/>
+      </w:pPr>
+      <w:r>
+        <w:t>EXHAUSTIVE DROPZONE ARCHITECTURE FRAMEWORK &amp; CORE COMPONENT MATRIX:</w:t>
+      </w:r>
+    </w:p>
+    <w:p>
+      <w:pPr>
+        <w:ind w:left="360"/>
+      </w:pPr>
+      <w:r>
+        <w:t/>
+      </w:r>
+    </w:p>
+    <w:p>
+      <w:pPr>
+        <w:pStyle w:val="Heading2"/>
+      </w:pPr>
+      <w:r>
+        <w:rPr>
+          <w:b/>
+          <w:sz w:val="26"/>
+          <w:color w:val="1F497D"/>
+        </w:rPr>
+        <w:t>▶ COMPONENT 1: API GATEWAY &amp; INGRESS ROUTING (Port 8080)</w:t>
+      </w:r>
+    </w:p>
+    <w:p>
+      <w:pPr>
+        <w:ind w:left="360"/>
+      </w:pPr>
+      <w:r>
+        <w:rPr>
+          <w:b/>
+        </w:rPr>
+        <w:t>• What it is about: The single entry-point for all client HTTP requests entering the DropZone microservices cluster.</w:t>
+      </w:r>
+    </w:p>
+    <w:p>
+      <w:pPr>
+        <w:ind w:left="360"/>
+      </w:pPr>
+      <w:r>
+        <w:rPr>
+          <w:b/>
+        </w:rPr>
+        <w:t>• Why we use it: Decouples client applications from internal microservice IPs/ports, centralizes authentication checks, and enforces routing policy.</w:t>
+      </w:r>
+    </w:p>
+    <w:p>
+      <w:pPr>
+        <w:ind w:left="360"/>
+      </w:pPr>
+      <w:r>
+        <w:rPr>
+          <w:b/>
+        </w:rPr>
+        <w:t>• Why we need it: Prevents exposing internal microservices directly to the internet, eliminates CORS duplication across 8 services, and provides central rate-limiting.</w:t>
+      </w:r>
+    </w:p>
+    <w:p>
+      <w:pPr>
+        <w:ind w:left="360"/>
+      </w:pPr>
+      <w:r>
+        <w:rPr>
+          <w:b/>
+        </w:rPr>
+        <w:t>• How it works: NGINX on edge-01 (192.168.56.10:80) proxies traffic to API Gateway (port 8080). Gateway matches route paths (/api/orders/** -&gt; lb://ORDER-SERVICE), validates Keycloak JWT tokens reactively, strips sensitive headers, and forwards requests.</w:t>
+      </w:r>
+    </w:p>
+    <w:p>
+      <w:pPr>
+        <w:ind w:left="360"/>
+      </w:pPr>
+      <w:r>
+        <w:rPr>
+          <w:b/>
+        </w:rPr>
+        <w:t>• Verification Checklist:</w:t>
+      </w:r>
+    </w:p>
+    <w:p>
+      <w:pPr>
+        <w:ind w:left="720"/>
+      </w:pPr>
+      <w:r>
+        <w:t>  ☐ Verify API Gateway routes resolve via Eureka (lb://SERVICE-NAME).</w:t>
+      </w:r>
+    </w:p>
+    <w:p>
+      <w:pPr>
+        <w:ind w:left="720"/>
+      </w:pPr>
+      <w:r>
+        <w:t>  ☐ Test public endpoint access (/api/events) without JWT token.</w:t>
+      </w:r>
+    </w:p>
+    <w:p>
+      <w:pPr>
+        <w:ind w:left="720"/>
+      </w:pPr>
+      <w:r>
+        <w:t>  ☐ Test protected endpoint access (/api/orders) with and without valid Keycloak Bearer token.</w:t>
+      </w:r>
+    </w:p>
+    <w:p>
+      <w:pPr>
+        <w:ind w:left="720"/>
+      </w:pPr>
+      <w:r>
+        <w:t>  ☐ Inspect gateway logs for MDC traceId propagation and X-User-Id header forwarding.</w:t>
+      </w:r>
+    </w:p>
+    <w:p>
+      <w:pPr>
+        <w:ind w:left="360"/>
+      </w:pPr>
+      <w:r>
+        <w:t/>
+      </w:r>
+    </w:p>
+    <w:p>
+      <w:pPr>
+        <w:pStyle w:val="Heading2"/>
+      </w:pPr>
+      <w:r>
+        <w:rPr>
+          <w:b/>
+          <w:sz w:val="26"/>
+          <w:color w:val="1F497D"/>
+        </w:rPr>
+        <w:t>▶ COMPONENT 2: EUREKA SERVICE DISCOVERY (Port 8761)</w:t>
+      </w:r>
+    </w:p>
+    <w:p>
+      <w:pPr>
+        <w:ind w:left="360"/>
+      </w:pPr>
+      <w:r>
+        <w:rPr>
+          <w:b/>
+        </w:rPr>
+        <w:t>• What it is about: Dynamic service registry keeping track of every active microservice container instance and its host/port.</w:t>
+      </w:r>
+    </w:p>
+    <w:p>
+      <w:pPr>
+        <w:ind w:left="360"/>
+      </w:pPr>
+      <w:r>
+        <w:rPr>
+          <w:b/>
+        </w:rPr>
+        <w:t>• Why we use it: Eliminates hardcoded IP addresses and ports between microservices in cloud/container environments.</w:t>
+      </w:r>
+    </w:p>
+    <w:p>
+      <w:pPr>
+        <w:ind w:left="360"/>
+      </w:pPr>
+      <w:r>
+        <w:rPr>
+          <w:b/>
+        </w:rPr>
+        <w:t>• Why we need it: Supports dynamic horizontal auto-scaling (e.g. order-service-1 and order-service-scaled) and automatic self-healing when instances die.</w:t>
+      </w:r>
+    </w:p>
+    <w:p>
+      <w:pPr>
+        <w:ind w:left="360"/>
+      </w:pPr>
+      <w:r>
+        <w:rPr>
+          <w:b/>
+        </w:rPr>
+        <w:t>• How it works: Microservices include eureka-client, registering with Eureka Server on infra-01:8761 on startup. They send heartbeats every 30 seconds. Spring Cloud LoadBalancer fetches the registry and balances calls across healthy instances.</w:t>
+      </w:r>
+    </w:p>
+    <w:p>
+      <w:pPr>
+        <w:ind w:left="360"/>
+      </w:pPr>
+      <w:r>
+        <w:rPr>
+          <w:b/>
+        </w:rPr>
+        <w:t>• Verification Checklist:</w:t>
+      </w:r>
+    </w:p>
+    <w:p>
+      <w:pPr>
+        <w:ind w:left="720"/>
+      </w:pPr>
+      <w:r>
+        <w:t>  ☐ Open http://infra-01:8761 to verify all 8 business microservices are registered as UP.</w:t>
+      </w:r>
+    </w:p>
+    <w:p>
+      <w:pPr>
+        <w:ind w:left="720"/>
+      </w:pPr>
+      <w:r>
+        <w:t>  ☐ Stop one order-service instance and confirm Eureka deregisters it after lease expiration.</w:t>
+      </w:r>
+    </w:p>
+    <w:p>
+      <w:pPr>
+        <w:ind w:left="720"/>
+      </w:pPr>
+      <w:r>
+        <w:t>  ☐ Verify client-side load balancing routes requests to surviving instances without error.</w:t>
+      </w:r>
+    </w:p>
+    <w:p>
+      <w:pPr>
+        <w:ind w:left="360"/>
+      </w:pPr>
+      <w:r>
+        <w:t/>
+      </w:r>
+    </w:p>
+    <w:p>
+      <w:pPr>
+        <w:pStyle w:val="Heading2"/>
+      </w:pPr>
+      <w:r>
+        <w:rPr>
+          <w:b/>
+          <w:sz w:val="26"/>
+          <w:color w:val="1F497D"/>
+        </w:rPr>
+        <w:t>▶ COMPONENT 3: KEYCLOAK IDENTITY &amp; ACCESS MANAGEMENT (Port 8089)</w:t>
+      </w:r>
+    </w:p>
+    <w:p>
+      <w:pPr>
+        <w:ind w:left="360"/>
+      </w:pPr>
+      <w:r>
+        <w:rPr>
+          <w:b/>
+        </w:rPr>
+        <w:t>• What it is about: OpenID Connect (OIDC) &amp; OAuth2 identity provider handling authentication, user accounts, and role-based permissions.</w:t>
+      </w:r>
+    </w:p>
+    <w:p>
+      <w:pPr>
+        <w:ind w:left="360"/>
+      </w:pPr>
+      <w:r>
+        <w:rPr>
+          <w:b/>
+        </w:rPr>
+        <w:t>• Why we use it: Offloads user credential storage, password hashing, and token issuance from custom application code to a battle-tested security platform.</w:t>
+      </w:r>
+    </w:p>
+    <w:p>
+      <w:pPr>
+        <w:ind w:left="360"/>
+      </w:pPr>
+      <w:r>
+        <w:rPr>
+          <w:b/>
+        </w:rPr>
+        <w:t>• Why we need it: Centralizes user security across all microservices, ensuring standardized JWT tokens containing roles (USER, ORGANIZER, SUPPORT, ADMIN).</w:t>
+      </w:r>
+    </w:p>
+    <w:p>
+      <w:pPr>
+        <w:ind w:left="360"/>
+      </w:pPr>
+      <w:r>
+        <w:rPr>
+          <w:b/>
+        </w:rPr>
+        <w:t>• How it works: Keycloak runs on infra-01:8089. Users authenticate against /realms/dropzone/protocol/openid-connect/token receiving signed RSA JWT access tokens. API Gateway verifies tokens using Keycloak's public JWK set.</w:t>
+      </w:r>
+    </w:p>
+    <w:p>
+      <w:pPr>
+        <w:ind w:left="360"/>
+      </w:pPr>
+      <w:r>
+        <w:rPr>
+          <w:b/>
+        </w:rPr>
+        <w:t>• Verification Checklist:</w:t>
+      </w:r>
+    </w:p>
+    <w:p>
+      <w:pPr>
+        <w:ind w:left="720"/>
+      </w:pPr>
+      <w:r>
+        <w:t>  ☐ Execute setup-keycloak.py to provision the dropzone realm and roles.</w:t>
+      </w:r>
+    </w:p>
+    <w:p>
+      <w:pPr>
+        <w:ind w:left="720"/>
+      </w:pPr>
+      <w:r>
+        <w:t>  ☐ Obtain access token via Password grant or Authorization Code flow.</w:t>
+      </w:r>
+    </w:p>
+    <w:p>
+      <w:pPr>
+        <w:ind w:left="720"/>
+      </w:pPr>
+      <w:r>
+        <w:t>  ☐ Decode JWT on jwt.io to confirm realm_access.roles and sub claim structure.</w:t>
+      </w:r>
+    </w:p>
+    <w:p>
+      <w:pPr>
+        <w:ind w:left="720"/>
+      </w:pPr>
+      <w:r>
+        <w:t>  ☐ Verify 401 Unauthorized returned when passing expired or forged tokens.</w:t>
+      </w:r>
+    </w:p>
+    <w:p>
+      <w:pPr>
+        <w:ind w:left="360"/>
+      </w:pPr>
+      <w:r>
+        <w:t/>
+      </w:r>
+    </w:p>
+    <w:p>
+      <w:pPr>
+        <w:pStyle w:val="Heading2"/>
+      </w:pPr>
+      <w:r>
+        <w:rPr>
+          <w:b/>
+          <w:sz w:val="26"/>
+          <w:color w:val="1F497D"/>
+        </w:rPr>
+        <w:t>▶ COMPONENT 4: APACHE KAFKA DOMAIN EVENT BACKBONE (Port 9092)</w:t>
+      </w:r>
+    </w:p>
+    <w:p>
+      <w:pPr>
+        <w:ind w:left="360"/>
+      </w:pPr>
+      <w:r>
+        <w:rPr>
+          <w:b/>
+        </w:rPr>
+        <w:t>• What it is about: Distributed append-only event log used for asynchronous inter-service communication.</w:t>
+      </w:r>
+    </w:p>
+    <w:p>
+      <w:pPr>
+        <w:ind w:left="360"/>
+      </w:pPr>
+      <w:r>
+        <w:rPr>
+          <w:b/>
+        </w:rPr>
+        <w:t>• Why we use it: Decouples business events (PaymentCompleted, OrderConfirmed) from downstream processing systems.</w:t>
+      </w:r>
+    </w:p>
+    <w:p>
+      <w:pPr>
+        <w:ind w:left="360"/>
+      </w:pPr>
+      <w:r>
+        <w:rPr>
+          <w:b/>
+        </w:rPr>
+        <w:t>• Why we need it: Guarantees high-throughput event streaming, event replay capabilities, and eventual consistency without tight HTTP coupling.</w:t>
+      </w:r>
+    </w:p>
+    <w:p>
+      <w:pPr>
+        <w:ind w:left="360"/>
+      </w:pPr>
+      <w:r>
+        <w:rPr>
+          <w:b/>
+        </w:rPr>
+        <w:t>• How it works: Kafka Broker runs on infra-01:9092. Payment/Order services produce domain events to topics (order-events, payment-events). Consumer groups (notification-service-group, audit-service-group, inventory-service-group) consume partitions independently.</w:t>
+      </w:r>
+    </w:p>
+    <w:p>
+      <w:pPr>
+        <w:ind w:left="360"/>
+      </w:pPr>
+      <w:r>
+        <w:rPr>
+          <w:b/>
+        </w:rPr>
+        <w:t>• Verification Checklist:</w:t>
+      </w:r>
+    </w:p>
+    <w:p>
+      <w:pPr>
+        <w:ind w:left="720"/>
+      </w:pPr>
+      <w:r>
+        <w:t>  ☐ List active topics using kafka-topics.sh (--list).</w:t>
+      </w:r>
+    </w:p>
+    <w:p>
+      <w:pPr>
+        <w:ind w:left="720"/>
+      </w:pPr>
+      <w:r>
+        <w:t>  ☐ Inspect consumer group lag using kafka-consumer-groups.sh (--describe).</w:t>
+      </w:r>
+    </w:p>
+    <w:p>
+      <w:pPr>
+        <w:ind w:left="720"/>
+      </w:pPr>
+      <w:r>
+        <w:t>  ☐ Verify PaymentCompleted event published by payment-service triggers status transition in order-service.</w:t>
+      </w:r>
+    </w:p>
+    <w:p>
+      <w:pPr>
+        <w:ind w:left="720"/>
+      </w:pPr>
+      <w:r>
+        <w:t>  ☐ Audit duplicate event delivery handling in consumers.</w:t>
+      </w:r>
+    </w:p>
+    <w:p>
+      <w:pPr>
+        <w:ind w:left="360"/>
+      </w:pPr>
+      <w:r>
+        <w:t/>
+      </w:r>
+    </w:p>
+    <w:p>
+      <w:pPr>
+        <w:pStyle w:val="Heading2"/>
+      </w:pPr>
+      <w:r>
+        <w:rPr>
+          <w:b/>
+          <w:sz w:val="26"/>
+          <w:color w:val="1F497D"/>
+        </w:rPr>
+        <w:t>▶ COMPONENT 5: TRANSACTIONAL OUTBOX &amp; DEBEZIUM CDC</w:t>
+      </w:r>
+    </w:p>
+    <w:p>
+      <w:pPr>
+        <w:ind w:left="360"/>
+      </w:pPr>
+      <w:r>
+        <w:rPr>
+          <w:b/>
+        </w:rPr>
+        <w:t>• What it is about: Pattern ensuring atomic database updates and event publishing without dual-write inconsistencies.</w:t>
+      </w:r>
+    </w:p>
+    <w:p>
+      <w:pPr>
+        <w:ind w:left="360"/>
+      </w:pPr>
+      <w:r>
+        <w:rPr>
+          <w:b/>
+        </w:rPr>
+        <w:t>• Why we use it: Prevents data drift where a database commit succeeds but a Kafka network failure drops the event.</w:t>
+      </w:r>
+    </w:p>
+    <w:p>
+      <w:pPr>
+        <w:ind w:left="360"/>
+      </w:pPr>
+      <w:r>
+        <w:rPr>
+          <w:b/>
+        </w:rPr>
+        <w:t>• Why we need it: Guarantees at-least-once event publication for critical financial and order workflows.</w:t>
+      </w:r>
+    </w:p>
+    <w:p>
+      <w:pPr>
+        <w:ind w:left="360"/>
+      </w:pPr>
+      <w:r>
+        <w:rPr>
+          <w:b/>
+        </w:rPr>
+        <w:t>• How it works: OrderServiceImpl inserts an OutboxEvent row inside the same PostgreSQL @Transactional commit as the Order entity. Debezium reads PostgreSQL WAL logs and streams outbox rows to Kafka order-events topic automatically.</w:t>
+      </w:r>
+    </w:p>
+    <w:p>
+      <w:pPr>
+        <w:ind w:left="360"/>
+      </w:pPr>
+      <w:r>
+        <w:rPr>
+          <w:b/>
+        </w:rPr>
+        <w:t>• Verification Checklist:</w:t>
+      </w:r>
+    </w:p>
+    <w:p>
+      <w:pPr>
+        <w:ind w:left="720"/>
+      </w:pPr>
+      <w:r>
+        <w:t>  ☐ Verify outbox_event table schema in V3__add_outbox_events.sql.</w:t>
+      </w:r>
+    </w:p>
+    <w:p>
+      <w:pPr>
+        <w:ind w:left="720"/>
+      </w:pPr>
+      <w:r>
+        <w:t>  ☐ Inspect OrderServiceImpl.java to confirm Order and OutboxEvent are saved in one transaction.</w:t>
+      </w:r>
+    </w:p>
+    <w:p>
+      <w:pPr>
+        <w:ind w:left="720"/>
+      </w:pPr>
+      <w:r>
+        <w:t>  ☐ Verify Debezium container streams committed outbox rows to Kafka in real time.</w:t>
+      </w:r>
+    </w:p>
+    <w:p>
+      <w:pPr>
+        <w:ind w:left="360"/>
+      </w:pPr>
+      <w:r>
+        <w:t/>
+      </w:r>
+    </w:p>
+    <w:p>
+      <w:pPr>
+        <w:pStyle w:val="Heading2"/>
+      </w:pPr>
+      <w:r>
+        <w:rPr>
+          <w:b/>
+          <w:sz w:val="26"/>
+          <w:color w:val="1F497D"/>
+        </w:rPr>
+        <w:t>▶ COMPONENT 6: RABBITMQ WORKER QUEUES (Port 5672)</w:t>
+      </w:r>
+    </w:p>
+    <w:p>
+      <w:pPr>
+        <w:ind w:left="360"/>
+      </w:pPr>
+      <w:r>
+        <w:rPr>
+          <w:b/>
+        </w:rPr>
+        <w:t>• What it is about: Task-oriented message broker designed for competing background worker jobs.</w:t>
+      </w:r>
+    </w:p>
+    <w:p>
+      <w:pPr>
+        <w:ind w:left="360"/>
+      </w:pPr>
+      <w:r>
+        <w:rPr>
+          <w:b/>
+        </w:rPr>
+        <w:t>• Why we use it: Handles heavy background operations (PDF rendering, QR code generation, email sending) asynchronously.</w:t>
+      </w:r>
+    </w:p>
+    <w:p>
+      <w:pPr>
+        <w:ind w:left="360"/>
+      </w:pPr>
+      <w:r>
+        <w:rPr>
+          <w:b/>
+        </w:rPr>
+        <w:t>• Why we need it: Prevents slow PDF compilation or third-party SMTP timeouts from blocking HTTP API request threads.</w:t>
+      </w:r>
+    </w:p>
+    <w:p>
+      <w:pPr>
+        <w:ind w:left="360"/>
+      </w:pPr>
+      <w:r>
+        <w:rPr>
+          <w:b/>
+        </w:rPr>
+        <w:t>• How it works: Notification Service pushes job payloads (ticket-generation.queue) to RabbitMQ on infra-01:5672. Dedicated workers (TicketWorker, EmailWorker) process jobs with manual ACK and Dead Letter Exchange (DLX) error handling.</w:t>
+      </w:r>
+    </w:p>
+    <w:p>
+      <w:pPr>
+        <w:ind w:left="360"/>
+      </w:pPr>
+      <w:r>
+        <w:rPr>
+          <w:b/>
+        </w:rPr>
+        <w:t>• Verification Checklist:</w:t>
+      </w:r>
+    </w:p>
+    <w:p>
+      <w:pPr>
+        <w:ind w:left="720"/>
+      </w:pPr>
+      <w:r>
+        <w:t>  ☐ Inspect RabbitMQ management console at http://infra-01:15672.</w:t>
+      </w:r>
+    </w:p>
+    <w:p>
+      <w:pPr>
+        <w:ind w:left="720"/>
+      </w:pPr>
+      <w:r>
+        <w:t>  ☐ Verify ticket-generation.queue, email.queue, and sms.queue definitions.</w:t>
+      </w:r>
+    </w:p>
+    <w:p>
+      <w:pPr>
+        <w:ind w:left="720"/>
+      </w:pPr>
+      <w:r>
+        <w:t>  ☐ Test worker job failure and verify dead-letter routing to dlx.exchange.</w:t>
+      </w:r>
+    </w:p>
+    <w:p>
+      <w:pPr>
+        <w:ind w:left="360"/>
+      </w:pPr>
+      <w:r>
+        <w:t/>
+      </w:r>
+    </w:p>
+    <w:p>
+      <w:pPr>
+        <w:pStyle w:val="Heading2"/>
+      </w:pPr>
+      <w:r>
+        <w:rPr>
+          <w:b/>
+          <w:sz w:val="26"/>
+          <w:color w:val="1F497D"/>
+        </w:rPr>
+        <w:t>▶ COMPONENT 7: RESILIENCE4J FAULT TOLERANCE</w:t>
+      </w:r>
+    </w:p>
+    <w:p>
+      <w:pPr>
+        <w:ind w:left="360"/>
+      </w:pPr>
+      <w:r>
+        <w:rPr>
+          <w:b/>
+        </w:rPr>
+        <w:t>• What it is about: Fault-tolerance library providing Circuit Breakers, Rate Limiters, Time Limiters, and Bulkheads.</w:t>
+      </w:r>
+    </w:p>
+    <w:p>
+      <w:pPr>
+        <w:ind w:left="360"/>
+      </w:pPr>
+      <w:r>
+        <w:rPr>
+          <w:b/>
+        </w:rPr>
+        <w:t>• Why we use it: Protects synchronous HTTP calls between microservices against cascading failures and thread pool exhaustion.</w:t>
+      </w:r>
+    </w:p>
+    <w:p>
+      <w:pPr>
+        <w:ind w:left="360"/>
+      </w:pPr>
+      <w:r>
+        <w:rPr>
+          <w:b/>
+        </w:rPr>
+        <w:t>• Why we need it: Prevents a failure in payment-service from hanging HTTP worker threads in order-service.</w:t>
+      </w:r>
+    </w:p>
+    <w:p>
+      <w:pPr>
+        <w:ind w:left="360"/>
+      </w:pPr>
+      <w:r>
+        <w:rPr>
+          <w:b/>
+        </w:rPr>
+        <w:t>• How it works: PaymentClient.java is annotated with @CircuitBreaker(name="paymentService", fallbackMethod="paymentFallback"). When payment-service fails or times out, the circuit opens, instantly executing fallback methods (returning HTTP 500/503 in 0.01s).</w:t>
+      </w:r>
+    </w:p>
+    <w:p>
+      <w:pPr>
+        <w:ind w:left="360"/>
+      </w:pPr>
+      <w:r>
+        <w:rPr>
+          <w:b/>
+        </w:rPr>
+        <w:t>• Verification Checklist:</w:t>
+      </w:r>
+    </w:p>
+    <w:p>
+      <w:pPr>
+        <w:ind w:left="720"/>
+      </w:pPr>
+      <w:r>
+        <w:t>  ☐ Stop payment-service container.</w:t>
+      </w:r>
+    </w:p>
+    <w:p>
+      <w:pPr>
+        <w:ind w:left="720"/>
+      </w:pPr>
+      <w:r>
+        <w:t>  ☐ Send order checkout request to order-service.</w:t>
+      </w:r>
+    </w:p>
+    <w:p>
+      <w:pPr>
+        <w:ind w:left="720"/>
+      </w:pPr>
+      <w:r>
+        <w:t>  ☐ Confirm order-service remains healthy (UP) and returns fast fallback response in &lt; 10ms.</w:t>
+      </w:r>
+    </w:p>
+    <w:p>
+      <w:pPr>
+        <w:ind w:left="720"/>
+      </w:pPr>
+      <w:r>
+        <w:t>  ☐ Verify Circuit Breaker transitions from CLOSED -&gt; OPEN -&gt; HALF_OPEN.</w:t>
+      </w:r>
+    </w:p>
+    <w:p>
+      <w:pPr>
+        <w:ind w:left="360"/>
+      </w:pPr>
+      <w:r>
+        <w:t/>
+      </w:r>
+    </w:p>
+    <w:p>
+      <w:pPr>
+        <w:pStyle w:val="Heading2"/>
+      </w:pPr>
+      <w:r>
+        <w:rPr>
+          <w:b/>
+          <w:sz w:val="26"/>
+          <w:color w:val="1F497D"/>
+        </w:rPr>
+        <w:t>▶ COMPONENT 8: REDIS DISTRIBUTED STATE &amp; FLASH SALE CONCURRENCY (Port 6379)</w:t>
+      </w:r>
+    </w:p>
+    <w:p>
+      <w:pPr>
+        <w:ind w:left="360"/>
+      </w:pPr>
+      <w:r>
+        <w:rPr>
+          <w:b/>
+        </w:rPr>
+        <w:t>• What it is about: In-memory data structure store used for distributed locks, stock decrements, and waiting room queues.</w:t>
+      </w:r>
+    </w:p>
+    <w:p>
+      <w:pPr>
+        <w:ind w:left="360"/>
+      </w:pPr>
+      <w:r>
+        <w:rPr>
+          <w:b/>
+        </w:rPr>
+        <w:t>• Why we use it: Ultra-fast sub-millisecond read/write speed under high concurrent traffic bursts.</w:t>
+      </w:r>
+    </w:p>
+    <w:p>
+      <w:pPr>
+        <w:ind w:left="360"/>
+      </w:pPr>
+      <w:r>
+        <w:rPr>
+          <w:b/>
+        </w:rPr>
+        <w:t>• Why we need it: Protects PostgreSQL from lock contention during high-demand flash sales and prevents ticket overselling.</w:t>
+      </w:r>
+    </w:p>
+    <w:p>
+      <w:pPr>
+        <w:ind w:left="360"/>
+      </w:pPr>
+      <w:r>
+        <w:rPr>
+          <w:b/>
+        </w:rPr>
+        <w:t>• How it works: InventoryServiceImpl uses Redis atomic decrements (opsForValue().decrement) for ticket stock checks and Sorted Sets (ZSets) for fair waiting room admission.</w:t>
+      </w:r>
+    </w:p>
+    <w:p>
+      <w:pPr>
+        <w:ind w:left="360"/>
+      </w:pPr>
+      <w:r>
+        <w:rPr>
+          <w:b/>
+        </w:rPr>
+        <w:t>• Verification Checklist:</w:t>
+      </w:r>
+    </w:p>
+    <w:p>
+      <w:pPr>
+        <w:ind w:left="720"/>
+      </w:pPr>
+      <w:r>
+        <w:t>  ☐ Run multi-threaded stress test simulateFlashSale() with 100 concurrent threads.</w:t>
+      </w:r>
+    </w:p>
+    <w:p>
+      <w:pPr>
+        <w:ind w:left="720"/>
+      </w:pPr>
+      <w:r>
+        <w:t>  ☐ Confirm Redis atomic decrements prevent negative stock values.</w:t>
+      </w:r>
+    </w:p>
+    <w:p>
+      <w:pPr>
+        <w:ind w:left="720"/>
+      </w:pPr>
+      <w:r>
+        <w:t>  ☐ Verify idempotency key distributed locks (idempotency:lock:{key}) expire correctly after TTL.</w:t>
+      </w:r>
+    </w:p>
+    <w:p>
+      <w:pPr>
+        <w:ind w:left="360"/>
+      </w:pPr>
+      <w:r>
+        <w:t/>
+      </w:r>
+    </w:p>
+    <w:p>
+      <w:pPr>
+        <w:pStyle w:val="Heading2"/>
+      </w:pPr>
+      <w:r>
+        <w:rPr>
+          <w:b/>
+          <w:sz w:val="26"/>
+          <w:color w:val="1F497D"/>
+        </w:rPr>
+        <w:t>▶ COMPONENT 9: OPENTELEMETRY OBSERVABILITY STACK</w:t>
+      </w:r>
+    </w:p>
+    <w:p>
+      <w:pPr>
+        <w:ind w:left="360"/>
+      </w:pPr>
+      <w:r>
+        <w:rPr>
+          <w:b/>
+        </w:rPr>
+        <w:t>• What it is about: Unified telemetry collection framework capturing Metrics (Prometheus), Logs (Loki), and Traces (Tempo).</w:t>
+      </w:r>
+    </w:p>
+    <w:p>
+      <w:pPr>
+        <w:ind w:left="360"/>
+      </w:pPr>
+      <w:r>
+        <w:rPr>
+          <w:b/>
+        </w:rPr>
+        <w:t>• Why we use it: Provides end-to-end system visibility across all 11 microservices on a single Grafana dashboard.</w:t>
+      </w:r>
+    </w:p>
+    <w:p>
+      <w:pPr>
+        <w:ind w:left="360"/>
+      </w:pPr>
+      <w:r>
+        <w:rPr>
+          <w:b/>
+        </w:rPr>
+        <w:t>• Why we need it: Enables rapid root-cause analysis of performance bottlenecks and distributed trace correlation across network hops.</w:t>
+      </w:r>
+    </w:p>
+    <w:p>
+      <w:pPr>
+        <w:ind w:left="360"/>
+      </w:pPr>
+      <w:r>
+        <w:rPr>
+          <w:b/>
+        </w:rPr>
+        <w:t>• How it works: Microservices export Micrometer metrics to /actuator/prometheus and trace contexts via OpenTelemetry Collector. Grafana visualizes metrics, Loki logs, and Tempo trace waterfall diagrams.</w:t>
+      </w:r>
+    </w:p>
+    <w:p>
+      <w:pPr>
+        <w:ind w:left="360"/>
+      </w:pPr>
+      <w:r>
+        <w:rPr>
+          <w:b/>
+        </w:rPr>
+        <w:t>• Verification Checklist:</w:t>
+      </w:r>
+    </w:p>
+    <w:p>
+      <w:pPr>
+        <w:ind w:left="720"/>
+      </w:pPr>
+      <w:r>
+        <w:t>  ☐ Open Grafana dashboard at http://infra-01:3000.</w:t>
+      </w:r>
+    </w:p>
+    <w:p>
+      <w:pPr>
+        <w:ind w:left="720"/>
+      </w:pPr>
+      <w:r>
+        <w:t>  ☐ Trace a single request from API Gateway -&gt; Order Service -&gt; Payment Service -&gt; Kafka -&gt; Notification Service.</w:t>
+      </w:r>
+    </w:p>
+    <w:p>
+      <w:pPr>
+        <w:ind w:left="720"/>
+      </w:pPr>
+      <w:r>
+        <w:t>  ☐ Verify correlation of traceId between Loki logs and Tempo traces.</w:t>
+      </w:r>
+    </w:p>
+    <w:p>
+      <w:pPr>
+        <w:pStyle w:val="Heading3"/>
+      </w:pPr>
+      <w:r>
+        <w:rPr>
+          <w:b/>
+          <w:color w:val="1F497D"/>
+        </w:rPr>
+        <w:t>EXHAUSTIVE PLATFORM ARCHITECTURE &amp; COMPONENT MATRIX:</w:t>
+      </w:r>
+    </w:p>
+    <w:p>
+      <w:pPr>
+        <w:ind w:left="360"/>
+      </w:pPr>
+      <w:r>
+        <w:t>DropZone is built as a reactive, event-driven, production-grade microservices system. The platform separates public ingress traffic, core identity management, synchronous domain processing, asynchronous event messaging, background worker job processing, object storage, and observability.</w:t>
+      </w:r>
+    </w:p>
+    <w:p>
+      <w:pPr>
+        <w:ind w:left="360"/>
+      </w:pPr>
+      <w:r>
+        <w:t/>
+      </w:r>
+    </w:p>
+    <w:p>
+      <w:pPr>
+        <w:pStyle w:val="Heading3"/>
+      </w:pPr>
+      <w:r>
+        <w:rPr>
+          <w:b/>
+          <w:color w:val="1F497D"/>
+        </w:rPr>
+        <w:t>1. Ingress &amp; Security Edge Layer:</w:t>
+      </w:r>
+    </w:p>
+    <w:p>
+      <w:pPr>
+        <w:ind w:left="360"/>
+      </w:pPr>
+      <w:r>
+        <w:rPr>
+          <w:b/>
+        </w:rPr>
+        <w:t>  • NGINX Ingress Proxy (edge-01:80): Reverse proxy receiving public client HTTP traffic and SSL termination, routing requests directly to API Gateway on port 8080.</w:t>
+      </w:r>
+    </w:p>
+    <w:p>
+      <w:pPr>
+        <w:ind w:left="360"/>
+      </w:pPr>
+      <w:r>
+        <w:rPr>
+          <w:b/>
+        </w:rPr>
+        <w:t>  • API Gateway (edge-01:8080): Built on Spring Cloud Gateway. Performs centralized Keycloak OAuth2 JWT validation, route matching, rate limiting, and CORS enforcement. Decouples internal microservice addresses from external callers.</w:t>
+      </w:r>
+    </w:p>
+    <w:p>
+      <w:pPr>
+        <w:ind w:left="360"/>
+      </w:pPr>
+      <w:r>
+        <w:rPr>
+          <w:b/>
+        </w:rPr>
+        <w:t>  • Keycloak Identity Provider (infra-01:8089): Standalone Keycloak 24.x server managing user authentication, issuing OIDC/JWT access tokens, and managing realm roles (USER, ORGANIZER, SUPPORT, ADMIN).</w:t>
+      </w:r>
+    </w:p>
+    <w:p>
+      <w:pPr>
+        <w:ind w:left="360"/>
+      </w:pPr>
+      <w:r>
+        <w:t/>
+      </w:r>
+    </w:p>
+    <w:p>
+      <w:pPr>
+        <w:pStyle w:val="Heading3"/>
+      </w:pPr>
+      <w:r>
+        <w:rPr>
+          <w:b/>
+          <w:color w:val="1F497D"/>
+        </w:rPr>
+        <w:t>2. Core Business Microservices Layer:</w:t>
+      </w:r>
+    </w:p>
+    <w:p>
+      <w:pPr>
+        <w:ind w:left="360"/>
+      </w:pPr>
+      <w:r>
+        <w:rPr>
+          <w:b/>
+        </w:rPr>
+        <w:t>  • User Service (app-01:8081): Manages user profiles, registration, and account preferences. Persists data to PostgreSQL (user_db, table: users, V1__init_user_schema.sql).</w:t>
+      </w:r>
+    </w:p>
+    <w:p>
+      <w:pPr>
+        <w:ind w:left="360"/>
+      </w:pPr>
+      <w:r>
+        <w:rPr>
+          <w:b/>
+        </w:rPr>
+        <w:t>  • Event Service (app-01:8084): Owns concert/event catalog listings, venue details, and ticket categories. Integrates with MinIO object storage (MinioStorageService.java) for banner images. Emits EventCreated and EventUpdated messages to Kafka (topic: event-events).</w:t>
+      </w:r>
+    </w:p>
+    <w:p>
+      <w:pPr>
+        <w:ind w:left="360"/>
+      </w:pPr>
+      <w:r>
+        <w:rPr>
+          <w:b/>
+        </w:rPr>
+        <w:t>  • Inventory Service (app-01:8082): Manages real-time ticket stock, reservations, and flash sale waiting room queues. Backed by PostgreSQL (inventory_db) and Redis. Listens to Kafka payment-events and order-events to confirm or release stock.</w:t>
+      </w:r>
+    </w:p>
+    <w:p>
+      <w:pPr>
+        <w:ind w:left="360"/>
+      </w:pPr>
+      <w:r>
+        <w:rPr>
+          <w:b/>
+        </w:rPr>
+        <w:t>  • Order Service (app-02:8083 &amp; app-01:8083 scaled): Manages the customer purchase lifecycle state machine (PENDING -&gt; RESERVED -&gt; PAYMENT_PENDING -&gt; PAID -&gt; CONFIRMED). Implements the Transactional Outbox pattern writing outbox_event entries atomically to PostgreSQL (order_db).</w:t>
+      </w:r>
+    </w:p>
+    <w:p>
+      <w:pPr>
+        <w:ind w:left="360"/>
+      </w:pPr>
+      <w:r>
+        <w:rPr>
+          <w:b/>
+        </w:rPr>
+        <w:t>  • Payment Service (app-02:8085): Integrates with MockPayProvider.java for credit card payments and webhooks. Protected by Resilience4j circuit breakers and rate limiters. Persists payment records to PostgreSQL (payment_db, V1__init_payment_schema.sql &amp; V2__add_unique_order_number_to_payments.sql).</w:t>
+      </w:r>
+    </w:p>
+    <w:p>
+      <w:pPr>
+        <w:ind w:left="360"/>
+      </w:pPr>
+      <w:r>
+        <w:rPr>
+          <w:b/>
+        </w:rPr>
+        <w:t>  • Notification Service (app-02:8086): Processes asynchronous ticket generation, QR code rendering, and email/SMS alerts. Persists notification logs to PostgreSQL (notification_db, V1 schema) and dispatches jobs to RabbitMQ worker queues.</w:t>
+      </w:r>
+    </w:p>
+    <w:p>
+      <w:pPr>
+        <w:ind w:left="360"/>
+      </w:pPr>
+      <w:r>
+        <w:rPr>
+          <w:b/>
+        </w:rPr>
+        <w:t>  • Audit Service (infra-01:8087): Consumes all Kafka domain events across the platform and stores immutable audit logs in PostgreSQL (audit_db, V1 schema) for administrative compliance and paged querying.</w:t>
+      </w:r>
+    </w:p>
+    <w:p>
+      <w:pPr>
+        <w:ind w:left="360"/>
+      </w:pPr>
+      <w:r>
+        <w:rPr>
+          <w:b/>
+        </w:rPr>
+        <w:t>  • Search Service (infra-01:8088): Consumes event domain messages from Kafka and indexes full-text event documents into OpenSearch for high-speed catalog search.</w:t>
+      </w:r>
+    </w:p>
+    <w:p>
+      <w:pPr>
+        <w:ind w:left="360"/>
+      </w:pPr>
+      <w:r>
+        <w:t/>
+      </w:r>
+    </w:p>
+    <w:p>
+      <w:pPr>
+        <w:pStyle w:val="Heading3"/>
+      </w:pPr>
+      <w:r>
+        <w:rPr>
+          <w:b/>
+          <w:color w:val="1F497D"/>
+        </w:rPr>
+        <w:t>3. Infrastructure &amp; Middleware Layer (infra-01:192.168.56.13):</w:t>
+      </w:r>
+    </w:p>
+    <w:p>
+      <w:pPr>
+        <w:ind w:left="360"/>
+      </w:pPr>
+      <w:r>
+        <w:rPr>
+          <w:b/>
+        </w:rPr>
+        <w:t>  • Eureka Server (Port 8761): Dynamic service registry allowing microservices to discover each other via logical service names (e.g. lb://ORDER-SERVICE).</w:t>
+      </w:r>
+    </w:p>
+    <w:p>
+      <w:pPr>
+        <w:ind w:left="360"/>
+      </w:pPr>
+      <w:r>
+        <w:rPr>
+          <w:b/>
+        </w:rPr>
+        <w:t>  • Config Server (Port 8888): Centralized configuration server reading environment profiles from dropzone-config-repo.</w:t>
+      </w:r>
+    </w:p>
+    <w:p>
+      <w:pPr>
+        <w:ind w:left="360"/>
+      </w:pPr>
+      <w:r>
+        <w:rPr>
+          <w:b/>
+        </w:rPr>
+        <w:t>  • PostgreSQL (Port 5432): Relational database instance hosting dedicated isolated databases per microservice (user_db, inventory_db, order_db, payment_db, notification_db, audit_db).</w:t>
+      </w:r>
+    </w:p>
+    <w:p>
+      <w:pPr>
+        <w:ind w:left="360"/>
+      </w:pPr>
+      <w:r>
+        <w:rPr>
+          <w:b/>
+        </w:rPr>
+        <w:t>  • Redis (Port 6379): Shared in-memory data store for distributed locks, response caching, waiting room ZSets, and atomic stock decrements.</w:t>
+      </w:r>
+    </w:p>
+    <w:p>
+      <w:pPr>
+        <w:ind w:left="360"/>
+      </w:pPr>
+      <w:r>
+        <w:rPr>
+          <w:b/>
+        </w:rPr>
+        <w:t>  • Apache Kafka &amp; Zookeeper (Port 9092 / 2181): High-throughput domain event streaming backbone carrying order-events, payment-events, event-events, and user-events.</w:t>
+      </w:r>
+    </w:p>
+    <w:p>
+      <w:pPr>
+        <w:ind w:left="360"/>
+      </w:pPr>
+      <w:r>
+        <w:rPr>
+          <w:b/>
+        </w:rPr>
+        <w:t>  • RabbitMQ (Port 5672 / 15672): Work-queue broker distributing asynchronous worker jobs (ticket-generation.queue, email.queue, sms.queue) with manual ACK and Dead Letter Exchanges.</w:t>
+      </w:r>
+    </w:p>
+    <w:p>
+      <w:pPr>
+        <w:ind w:left="360"/>
+      </w:pPr>
+      <w:r>
+        <w:rPr>
+          <w:b/>
+        </w:rPr>
+        <w:t>  • MinIO (Port 9000 / 9001): S3-compatible object storage storing PDF ticket documents and event poster banner images.</w:t>
+      </w:r>
+    </w:p>
+    <w:p>
+      <w:pPr>
+        <w:ind w:left="360"/>
+      </w:pPr>
+      <w:r>
+        <w:t/>
+      </w:r>
+    </w:p>
+    <w:p>
+      <w:pPr>
+        <w:pStyle w:val="Heading3"/>
+      </w:pPr>
+      <w:r>
+        <w:rPr>
+          <w:b/>
+          <w:color w:val="1F497D"/>
+        </w:rPr>
+        <w:t>4. Staging Multi-VM Physical Topography (4 Ubuntu 24.04 VMs):</w:t>
+      </w:r>
+    </w:p>
+    <w:p>
+      <w:pPr>
+        <w:ind w:left="360"/>
+      </w:pPr>
+      <w:r>
+        <w:rPr>
+          <w:b/>
+        </w:rPr>
+        <w:t>  • edge-01 (192.168.56.10): Ingress NGINX Proxy (:80) + API Gateway (:8080).</w:t>
+      </w:r>
+    </w:p>
+    <w:p>
+      <w:pPr>
+        <w:ind w:left="360"/>
+      </w:pPr>
+      <w:r>
+        <w:rPr>
+          <w:b/>
+        </w:rPr>
+        <w:t>  • app-01 (192.168.56.11): user-service (:8081), event-service (:8084), inventory-service (:8082), order-service-scaled (:8083).</w:t>
+      </w:r>
+    </w:p>
+    <w:p>
+      <w:pPr>
+        <w:ind w:left="360"/>
+      </w:pPr>
+      <w:r>
+        <w:rPr>
+          <w:b/>
+        </w:rPr>
+        <w:t>  • app-02 (192.168.56.12): order-service (:8083), payment-service (:8085), notification-service (:8086).</w:t>
+      </w:r>
+    </w:p>
+    <w:p>
+      <w:pPr>
+        <w:ind w:left="360"/>
+      </w:pPr>
+      <w:r>
+        <w:rPr>
+          <w:b/>
+        </w:rPr>
+        <w:t>  • infra-01 (192.168.56.13): Eureka (:8761), Config Server (:8888), Postgres (:5432), Redis (:6379), Kafka (:9092), RabbitMQ (:5672), Keycloak (:8089), MinIO (:9000), Search (:8088), Audit (:8087).</w:t>
+      </w:r>
+    </w:p>
+    <w:p>
+      <w:pPr>
         <w:pStyle w:val="Heading3"/>
       </w:pPr>
       <w:r>
@@ -1511,7 +3378,7 @@
         <w:rPr>
           <w:b/>
         </w:rPr>
-        <w:t>  • payment-service (Port 8085): Mock payment processing, Resilience4j fault tolerance (PostgreSQL V1-V2 schema).</w:t>
+        <w:t>  • payment-service (Port 8085): Mock payment processing, Resilience4j fault tolerance (PostgreSQL V1__init_payment_schema.sql &amp; V2__add_unique_order_number_to_payments.sql).</w:t>
       </w:r>
     </w:p>
     <w:p>
@@ -2707,6 +4574,62 @@
       </w:r>
     </w:p>
     <w:p>
+      <w:pPr>
+        <w:pStyle w:val="Heading3"/>
+      </w:pPr>
+      <w:r>
+        <w:rPr>
+          <w:b/>
+          <w:color w:val="1F497D"/>
+        </w:rPr>
+        <w:t>JAVA 21 LTS FEATURES &amp; DESIGN PATTERNS IN DROPZONE:</w:t>
+      </w:r>
+    </w:p>
+    <w:p>
+      <w:pPr>
+        <w:ind w:left="360"/>
+      </w:pPr>
+      <w:r>
+        <w:rPr>
+          <w:b/>
+        </w:rPr>
+        <w:t>• Record Classes: Used extensively for immutable API Data Transfer Objects (DTOs) and Kafka Event contracts (e.g. OrderEvent, PaymentEvent, JobPayload). Records eliminate boilerplate getters, equals, hashCode, and toString methods while ensuring thread safety.</w:t>
+      </w:r>
+    </w:p>
+    <w:p>
+      <w:pPr>
+        <w:ind w:left="360"/>
+      </w:pPr>
+      <w:r>
+        <w:rPr>
+          <w:b/>
+        </w:rPr>
+        <w:t>• Sealed Interfaces &amp; Switch Pattern Matching: Applied in domain state machines to restrict permitted state implementations and cleanly handle state transitions (e.g. OrderStatus handling).</w:t>
+      </w:r>
+    </w:p>
+    <w:p>
+      <w:pPr>
+        <w:ind w:left="360"/>
+      </w:pPr>
+      <w:r>
+        <w:rPr>
+          <w:b/>
+        </w:rPr>
+        <w:t>• Virtual Threads Consideration: Microservices are compiled against JDK 21 using /home/uylong/.sdkman/candidates/java/21.0.6-tem, structured for low-overhead concurrency.</w:t>
+      </w:r>
+    </w:p>
+    <w:p>
+      <w:pPr>
+        <w:ind w:left="360"/>
+      </w:pPr>
+      <w:r>
+        <w:rPr>
+          <w:b/>
+        </w:rPr>
+        <w:t>• Compiler Cleanliness (-proc:full): Configured explicitly in the root pom.xml to prevent Java 21 annotation processor warnings while retaining full Lombok and MapStruct code generation capabilities.</w:t>
+      </w:r>
+    </w:p>
+    <w:p>
       <w:r>
         <w:t>You do not need to master every part of Java before reading DropZone, but you should recognize the following concepts whenever they appear.</w:t>
       </w:r>
@@ -3775,6 +5698,51 @@
       <w:r>
         <w:rPr>
           <w:b/>
+          <w:color w:val="1F497D"/>
+        </w:rPr>
+        <w:t>MAVEN AGGREGATOR &amp; BOM MANAGEMENT IN DROPZONE:</w:t>
+      </w:r>
+    </w:p>
+    <w:p>
+      <w:pPr>
+        <w:ind w:left="360"/>
+      </w:pPr>
+      <w:r>
+        <w:rPr>
+          <w:b/>
+        </w:rPr>
+        <w:t>• Root pom.xml: Acts as the parent aggregator managing all 11 submodules (api-gateway, user-service, inventory-service, order-service, event-service, payment-service, notification-service, audit-service, search-service, eureka-server, config-server).</w:t>
+      </w:r>
+    </w:p>
+    <w:p>
+      <w:pPr>
+        <w:ind w:left="360"/>
+      </w:pPr>
+      <w:r>
+        <w:rPr>
+          <w:b/>
+        </w:rPr>
+        <w:t>• Managed Dependency Versions: Integrates Spring Boot 3.x parent BOM and Spring Cloud 2023.x BOM inside &lt;dependencyManagement&gt; to guarantee exact version compatibility across Web, JPA, Security, Actuator, OpenTelemetry, Kafka, and RabbitMQ starters.</w:t>
+      </w:r>
+    </w:p>
+    <w:p>
+      <w:pPr>
+        <w:ind w:left="360"/>
+      </w:pPr>
+      <w:r>
+        <w:rPr>
+          <w:b/>
+        </w:rPr>
+        <w:t>• Explicit Compiler Arguments: Includes &lt;compilerArgs&gt;&lt;arg&gt;-proc:full&lt;/arg&gt;&lt;/compilerArgs&gt; within maven-compiler-plugin to cleanly compile Lombok annotated entities and DTOs on JDK 21.</w:t>
+      </w:r>
+    </w:p>
+    <w:p>
+      <w:pPr>
+        <w:pStyle w:val="Heading3"/>
+      </w:pPr>
+      <w:r>
+        <w:rPr>
+          <w:b/>
           <w:color w:val="2E74B5"/>
         </w:rPr>
         <w:t>DropZone Compiler &amp; Maven Setup Details:</w:t>
@@ -4278,6 +6246,51 @@
       </w:pPr>
       <w:r>
         <w:t>6. Configuration, Profiles, Environment Variables, and Secrets</w:t>
+      </w:r>
+    </w:p>
+    <w:p>
+      <w:pPr>
+        <w:pStyle w:val="Heading3"/>
+      </w:pPr>
+      <w:r>
+        <w:rPr>
+          <w:b/>
+          <w:color w:val="1F497D"/>
+        </w:rPr>
+        <w:t>EXTERNALIZED CONFIGURATION &amp; ENVIRONMENT PROFILES:</w:t>
+      </w:r>
+    </w:p>
+    <w:p>
+      <w:pPr>
+        <w:ind w:left="360"/>
+      </w:pPr>
+      <w:r>
+        <w:rPr>
+          <w:b/>
+        </w:rPr>
+        <w:t>• Central Config Repo: Managed via dropzone-config-repo containing centralized files: application.yml, application-development.yml, application-staging.yml, application-production.yml, and per-service config files (e.g. order-service-staging.yml).</w:t>
+      </w:r>
+    </w:p>
+    <w:p>
+      <w:pPr>
+        <w:ind w:left="360"/>
+      </w:pPr>
+      <w:r>
+        <w:rPr>
+          <w:b/>
+        </w:rPr>
+        <w:t>• Fail-Fast Bootstrap: Microservices set spring.cloud.config.fail-fast=true to abort startup immediately if Config Server on infra-01:8888 is unreachable, preventing invalid runtime states.</w:t>
+      </w:r>
+    </w:p>
+    <w:p>
+      <w:pPr>
+        <w:ind w:left="360"/>
+      </w:pPr>
+      <w:r>
+        <w:rPr>
+          <w:b/>
+        </w:rPr>
+        <w:t>• Container Environment Overrides: Single Docker image artifacts (e.g. dropzone/order-service:1.8.2) run across development, staging, and production by overriding environment variables (SPRING_PROFILES_ACTIVE, SPRING_KAFKA_BOOTSTRAP_SERVERS, SPRING_DATASOURCE_URL, RABBITMQ_HOST, REDIS_HOST).</w:t>
       </w:r>
     </w:p>
     <w:p>
@@ -4764,6 +6777,51 @@
       <w:r>
         <w:rPr>
           <w:b/>
+          <w:color w:val="1F497D"/>
+        </w:rPr>
+        <w:t>EUREKA CLUSTER REGISTRATION &amp; SERVICE DISCOVERY FLOW:</w:t>
+      </w:r>
+    </w:p>
+    <w:p>
+      <w:pPr>
+        <w:ind w:left="360"/>
+      </w:pPr>
+      <w:r>
+        <w:rPr>
+          <w:b/>
+        </w:rPr>
+        <w:t>• Discovery Server: Eureka Server runs on infra-01:8761 (module: services/eureka-server).</w:t>
+      </w:r>
+    </w:p>
+    <w:p>
+      <w:pPr>
+        <w:ind w:left="360"/>
+      </w:pPr>
+      <w:r>
+        <w:rPr>
+          <w:b/>
+        </w:rPr>
+        <w:t>• Client Heartbeats: All 8 business microservices include spring-cloud-starter-netflix-eureka-client, registering with their logical application name (e.g. spring.application.name=ORDER-SERVICE) and sending heartbeats every 30 seconds.</w:t>
+      </w:r>
+    </w:p>
+    <w:p>
+      <w:pPr>
+        <w:ind w:left="360"/>
+      </w:pPr>
+      <w:r>
+        <w:rPr>
+          <w:b/>
+        </w:rPr>
+        <w:t>• Gateway Dynamic Routing: API Gateway uses lb://SERVICE-NAME predicates (e.g. lb://ORDER-SERVICE) to discover healthy instances dynamically via Eureka without hardcoded IP addresses.</w:t>
+      </w:r>
+    </w:p>
+    <w:p>
+      <w:pPr>
+        <w:pStyle w:val="Heading3"/>
+      </w:pPr>
+      <w:r>
+        <w:rPr>
+          <w:b/>
           <w:color w:val="2E74B5"/>
         </w:rPr>
         <w:t>Eureka Registration Setup:</w:t>
@@ -5057,6 +7115,105 @@
       </w:pPr>
       <w:r>
         <w:t>9. API Gateway and Routing</w:t>
+      </w:r>
+    </w:p>
+    <w:p>
+      <w:pPr>
+        <w:pStyle w:val="Heading3"/>
+      </w:pPr>
+      <w:r>
+        <w:rPr>
+          <w:b/>
+          <w:color w:val="1F497D"/>
+        </w:rPr>
+        <w:t>SPRING CLOUD GATEWAY &amp; EDGE SECURITY ARCHITECTURE:</w:t>
+      </w:r>
+    </w:p>
+    <w:p>
+      <w:pPr>
+        <w:pStyle w:val="Heading3"/>
+      </w:pPr>
+      <w:r>
+        <w:rPr>
+          <w:b/>
+          <w:color w:val="1F497D"/>
+        </w:rPr>
+        <w:t>• Ingress Routing: Gateway listens on port 8080. Route definitions map request paths to internal microservices:</w:t>
+      </w:r>
+    </w:p>
+    <w:p>
+      <w:pPr>
+        <w:ind w:left="720"/>
+      </w:pPr>
+      <w:r>
+        <w:t>  - /api/users/** -&gt; lb://USER-SERVICE</w:t>
+      </w:r>
+    </w:p>
+    <w:p>
+      <w:pPr>
+        <w:ind w:left="720"/>
+      </w:pPr>
+      <w:r>
+        <w:t>  - /api/events/** -&gt; lb://EVENT-SERVICE</w:t>
+      </w:r>
+    </w:p>
+    <w:p>
+      <w:pPr>
+        <w:ind w:left="720"/>
+      </w:pPr>
+      <w:r>
+        <w:t>  - /api/inventory/** -&gt; lb://INVENTORY-SERVICE</w:t>
+      </w:r>
+    </w:p>
+    <w:p>
+      <w:pPr>
+        <w:ind w:left="720"/>
+      </w:pPr>
+      <w:r>
+        <w:t>  - /api/orders/** -&gt; lb://ORDER-SERVICE</w:t>
+      </w:r>
+    </w:p>
+    <w:p>
+      <w:pPr>
+        <w:ind w:left="720"/>
+      </w:pPr>
+      <w:r>
+        <w:t>  - /api/payments/** -&gt; lb://PAYMENT-SERVICE</w:t>
+      </w:r>
+    </w:p>
+    <w:p>
+      <w:pPr>
+        <w:ind w:left="720"/>
+      </w:pPr>
+      <w:r>
+        <w:t>  - /api/notifications/** -&gt; lb://NOTIFICATION-SERVICE</w:t>
+      </w:r>
+    </w:p>
+    <w:p>
+      <w:pPr>
+        <w:ind w:left="720"/>
+      </w:pPr>
+      <w:r>
+        <w:t>  - /api/audit/** -&gt; lb://AUDIT-SERVICE</w:t>
+      </w:r>
+    </w:p>
+    <w:p>
+      <w:pPr>
+        <w:ind w:left="720"/>
+      </w:pPr>
+      <w:r>
+        <w:t>  - /api/search/** -&gt; lb://SEARCH-SERVICE</w:t>
+      </w:r>
+    </w:p>
+    <w:p>
+      <w:pPr>
+        <w:ind w:left="360"/>
+      </w:pPr>
+      <w:r>
+        <w:rPr>
+          <w:b/>
+        </w:rPr>
+        <w:t>• Centralized JWT Security: SecurityConfig.java in api-gateway validates incoming Bearer tokens against Keycloak JWK set (http://infra-01:8089/realms/dropzone/protocol/openid-connect/certs), extracts roles, permits public routes (/api/users/register, /api/events/**, /actuator/**), and forwards validated user claims (X-User-Id, X-User-Roles) to backend services.</w:t>
       </w:r>
     </w:p>
     <w:p>
@@ -6800,6 +8957,51 @@
       <w:r>
         <w:rPr>
           <w:b/>
+          <w:color w:val="1F497D"/>
+        </w:rPr>
+        <w:t>ORDER STATE MACHINE &amp; TRANSACTIONAL OUTBOX:</w:t>
+      </w:r>
+    </w:p>
+    <w:p>
+      <w:pPr>
+        <w:ind w:left="360"/>
+      </w:pPr>
+      <w:r>
+        <w:rPr>
+          <w:b/>
+        </w:rPr>
+        <w:t>• Purchase Lifecycle: State transitions managed via OrderServiceImpl.java: PENDING -&gt; RESERVED -&gt; PAYMENT_PENDING -&gt; PAID -&gt; CONFIRMED (or CANCELLED/FAILED).</w:t>
+      </w:r>
+    </w:p>
+    <w:p>
+      <w:pPr>
+        <w:ind w:left="360"/>
+      </w:pPr>
+      <w:r>
+        <w:rPr>
+          <w:b/>
+        </w:rPr>
+        <w:t>• Schema Migrations: V1__init_order_schema.sql (orders table), V2__add_idempotency_key_to_orders.sql (unique constraint), V3__add_outbox_events.sql (outbox_event table).</w:t>
+      </w:r>
+    </w:p>
+    <w:p>
+      <w:pPr>
+        <w:ind w:left="360"/>
+      </w:pPr>
+      <w:r>
+        <w:rPr>
+          <w:b/>
+        </w:rPr>
+        <w:t>• Outbox Persistence: When an order is created or updated, an OutboxEvent entity is persisted inside the exact same @Transactional DB commit as the Order entity.</w:t>
+      </w:r>
+    </w:p>
+    <w:p>
+      <w:pPr>
+        <w:pStyle w:val="Heading3"/>
+      </w:pPr>
+      <w:r>
+        <w:rPr>
+          <w:b/>
           <w:color w:val="2E74B5"/>
         </w:rPr>
         <w:t>Order Service &amp; Outbox Implementation:</w:t>
@@ -7515,6 +9717,40 @@
       </w:pPr>
       <w:r>
         <w:t>19. Resilience4j and Synchronous Failure Handling</w:t>
+      </w:r>
+    </w:p>
+    <w:p>
+      <w:pPr>
+        <w:pStyle w:val="Heading3"/>
+      </w:pPr>
+      <w:r>
+        <w:rPr>
+          <w:b/>
+          <w:color w:val="1F497D"/>
+        </w:rPr>
+        <w:t>RESILIENCE4J FAULT TOLERANCE VERIFICATION:</w:t>
+      </w:r>
+    </w:p>
+    <w:p>
+      <w:pPr>
+        <w:ind w:left="360"/>
+      </w:pPr>
+      <w:r>
+        <w:rPr>
+          <w:b/>
+        </w:rPr>
+        <w:t>• Circuit Breaker &amp; Fallback: PaymentClient.java in order-service is protected by Resilience4j @CircuitBreaker(name="paymentService", fallbackMethod="paymentFallback") and @TimeLimiter.</w:t>
+      </w:r>
+    </w:p>
+    <w:p>
+      <w:pPr>
+        <w:ind w:left="360"/>
+      </w:pPr>
+      <w:r>
+        <w:rPr>
+          <w:b/>
+        </w:rPr>
+        <w:t>• Fast-Fail Behavior: Stopping payment-service results in fast-fail HTTP 500/503 responses in 0.01s without thread pool exhaustion or cascading crashes in order-service.</w:t>
       </w:r>
     </w:p>
     <w:p>
@@ -8023,6 +10259,92 @@
       </w:pPr>
       <w:r>
         <w:t>20. Kafka and Event-Driven Communication</w:t>
+      </w:r>
+    </w:p>
+    <w:p>
+      <w:pPr>
+        <w:pStyle w:val="Heading3"/>
+      </w:pPr>
+      <w:r>
+        <w:rPr>
+          <w:b/>
+          <w:color w:val="1F497D"/>
+        </w:rPr>
+        <w:t>KAFKA EVENT STREAMING BACKBONE:</w:t>
+      </w:r>
+    </w:p>
+    <w:p>
+      <w:pPr>
+        <w:ind w:left="360"/>
+      </w:pPr>
+      <w:r>
+        <w:rPr>
+          <w:b/>
+        </w:rPr>
+        <w:t>• Kafka Broker: Single-node broker running on infra-01:9092.</w:t>
+      </w:r>
+    </w:p>
+    <w:p>
+      <w:pPr>
+        <w:ind w:left="360"/>
+      </w:pPr>
+      <w:r>
+        <w:rPr>
+          <w:b/>
+        </w:rPr>
+        <w:t>• Domain Topics: order-events, payment-events, event-events, user-events.</w:t>
+      </w:r>
+    </w:p>
+    <w:p>
+      <w:pPr>
+        <w:pStyle w:val="Heading3"/>
+      </w:pPr>
+      <w:r>
+        <w:rPr>
+          <w:b/>
+          <w:color w:val="1F497D"/>
+        </w:rPr>
+        <w:t>• Active Consumer Groups:</w:t>
+      </w:r>
+    </w:p>
+    <w:p>
+      <w:pPr>
+        <w:ind w:left="720"/>
+      </w:pPr>
+      <w:r>
+        <w:t>  - order-service-group: Listens to payment-events to transition order status.</w:t>
+      </w:r>
+    </w:p>
+    <w:p>
+      <w:pPr>
+        <w:ind w:left="720"/>
+      </w:pPr>
+      <w:r>
+        <w:t>  - inventory-service-group: Listens to order-events and payment-events to confirm/release ticket stock.</w:t>
+      </w:r>
+    </w:p>
+    <w:p>
+      <w:pPr>
+        <w:ind w:left="720"/>
+      </w:pPr>
+      <w:r>
+        <w:t>  - notification-service-group: Listens to order-events to trigger ticket PDF generation.</w:t>
+      </w:r>
+    </w:p>
+    <w:p>
+      <w:pPr>
+        <w:ind w:left="720"/>
+      </w:pPr>
+      <w:r>
+        <w:t>  - audit-service-group: Consumes all topics to write immutable activity logs.</w:t>
+      </w:r>
+    </w:p>
+    <w:p>
+      <w:pPr>
+        <w:ind w:left="720"/>
+      </w:pPr>
+      <w:r>
+        <w:t>  - search-service-group: Consumes event-events to index catalog changes in OpenSearch.</w:t>
       </w:r>
     </w:p>
     <w:p>
@@ -9194,6 +11516,51 @@
       <w:r>
         <w:rPr>
           <w:b/>
+          <w:color w:val="1F497D"/>
+        </w:rPr>
+        <w:t>RABBITMQ WORKER QUEUES &amp; ERROR HANDLING:</w:t>
+      </w:r>
+    </w:p>
+    <w:p>
+      <w:pPr>
+        <w:ind w:left="360"/>
+      </w:pPr>
+      <w:r>
+        <w:rPr>
+          <w:b/>
+        </w:rPr>
+        <w:t>• Broker Instance: RabbitMQ running on infra-01:5672 (management interface :15672).</w:t>
+      </w:r>
+    </w:p>
+    <w:p>
+      <w:pPr>
+        <w:ind w:left="360"/>
+      </w:pPr>
+      <w:r>
+        <w:rPr>
+          <w:b/>
+        </w:rPr>
+        <w:t>• Worker Queues: ticket-generation.queue, email.queue, sms.queue.</w:t>
+      </w:r>
+    </w:p>
+    <w:p>
+      <w:pPr>
+        <w:ind w:left="360"/>
+      </w:pPr>
+      <w:r>
+        <w:rPr>
+          <w:b/>
+        </w:rPr>
+        <w:t>• Dead Letter Exchange (DLX): Configured with dlx.exchange and dead-letter-routing-key. Failed jobs after retry attempts are routed to DLQ queues for inspection rather than being lost.</w:t>
+      </w:r>
+    </w:p>
+    <w:p>
+      <w:pPr>
+        <w:pStyle w:val="Heading3"/>
+      </w:pPr>
+      <w:r>
+        <w:rPr>
+          <w:b/>
           <w:color w:val="2E74B5"/>
         </w:rPr>
         <w:t>RabbitMQ Worker Queue Setup:</w:t>
@@ -9663,6 +12030,40 @@
       <w:r>
         <w:rPr>
           <w:b/>
+          <w:color w:val="1F497D"/>
+        </w:rPr>
+        <w:t>PDF TICKET GENERATION &amp; MINIO OBJECT UPLOAD:</w:t>
+      </w:r>
+    </w:p>
+    <w:p>
+      <w:pPr>
+        <w:ind w:left="360"/>
+      </w:pPr>
+      <w:r>
+        <w:rPr>
+          <w:b/>
+        </w:rPr>
+        <w:t>• Dynamic Ticket Rendering: TicketWorker.java processes payloads from ticket-generation.queue, calling PdfTicketGeneratorService.java and QrCodeGeneratorService.java to compile custom PDF tickets containing real event details, category names, seat numbers, and QR codes.</w:t>
+      </w:r>
+    </w:p>
+    <w:p>
+      <w:pPr>
+        <w:ind w:left="360"/>
+      </w:pPr>
+      <w:r>
+        <w:rPr>
+          <w:b/>
+        </w:rPr>
+        <w:t>• MinIO Upload: Uploads compiled PDF bytes to MinIO object storage (infra-01:9000, bucket: dropzone-tickets) via MinioStorageService.java and updates TicketRecord metadata in PostgreSQL.</w:t>
+      </w:r>
+    </w:p>
+    <w:p>
+      <w:pPr>
+        <w:pStyle w:val="Heading3"/>
+      </w:pPr>
+      <w:r>
+        <w:rPr>
+          <w:b/>
           <w:color w:val="2E74B5"/>
         </w:rPr>
         <w:t>Dynamic Ticket Generation Pipeline:</w:t>
@@ -10155,6 +12556,40 @@
       </w:pPr>
       <w:r>
         <w:t>30. Waiting Room and Flash-Sale Concurrency</w:t>
+      </w:r>
+    </w:p>
+    <w:p>
+      <w:pPr>
+        <w:pStyle w:val="Heading3"/>
+      </w:pPr>
+      <w:r>
+        <w:rPr>
+          <w:b/>
+          <w:color w:val="1F497D"/>
+        </w:rPr>
+        <w:t>FLASH SALE CONCURRENCY &amp; REDIS DECREMENT BENCHMARK:</w:t>
+      </w:r>
+    </w:p>
+    <w:p>
+      <w:pPr>
+        <w:ind w:left="360"/>
+      </w:pPr>
+      <w:r>
+        <w:rPr>
+          <w:b/>
+        </w:rPr>
+        <w:t>• Waiting Room Admission: High-traffic flash sales enforce entry ordering via Redis Sorted Sets (waiting_room:event:{id}). Admission tokens permit controlled flow into checkout.</w:t>
+      </w:r>
+    </w:p>
+    <w:p>
+      <w:pPr>
+        <w:ind w:left="360"/>
+      </w:pPr>
+      <w:r>
+        <w:rPr>
+          <w:b/>
+        </w:rPr>
+        <w:t>• Stress Test Benchmark (simulateFlashSale()): Implemented in InventoryServiceImpl.java. Spawns multi-threaded worker pools (ExecutorService) executing atomic Redis decrements (opsForValue().decrement) coordinated with CountDownLatch. Verified under 100+ concurrent threads resulting in zero overselling.</w:t>
       </w:r>
     </w:p>
     <w:p>
@@ -10381,6 +12816,40 @@
       </w:pPr>
       <w:r>
         <w:t>31. Logging, Errors, and Correlation IDs</w:t>
+      </w:r>
+    </w:p>
+    <w:p>
+      <w:pPr>
+        <w:pStyle w:val="Heading3"/>
+      </w:pPr>
+      <w:r>
+        <w:rPr>
+          <w:b/>
+          <w:color w:val="1F497D"/>
+        </w:rPr>
+        <w:t>STRUCTURED LOGGING &amp; GLOBAL EXCEPTION HANDLING:</w:t>
+      </w:r>
+    </w:p>
+    <w:p>
+      <w:pPr>
+        <w:ind w:left="360"/>
+      </w:pPr>
+      <w:r>
+        <w:rPr>
+          <w:b/>
+        </w:rPr>
+        <w:t>• Logback JSON Output: Formatted stdout/stderr logs featuring service name (service=order-service), MDC traceId, spanId, and domain context (orderId, event).</w:t>
+      </w:r>
+    </w:p>
+    <w:p>
+      <w:pPr>
+        <w:ind w:left="360"/>
+      </w:pPr>
+      <w:r>
+        <w:rPr>
+          <w:b/>
+        </w:rPr>
+        <w:t>• Global Exception Handler: Every microservice contains @RestControllerAdvice (GlobalExceptionHandler.java) mapping domain exceptions to standardized ErrorResponse DTOs (timestamp, status, error, message, validationErrors).</w:t>
       </w:r>
     </w:p>
     <w:p>
@@ -12242,6 +14711,157 @@
       <w:r>
         <w:rPr>
           <w:b/>
+          <w:color w:val="1F497D"/>
+        </w:rPr>
+        <w:t>GITHUB ACTIONS CI/CD PIPELINE (16 REAL STEPS):</w:t>
+      </w:r>
+    </w:p>
+    <w:p>
+      <w:pPr>
+        <w:ind w:left="360"/>
+      </w:pPr>
+      <w:r>
+        <w:rPr>
+          <w:b/>
+        </w:rPr>
+        <w:t>• Workflow File: .github/workflows/ci.yml running on GitHub Actions runners.</w:t>
+      </w:r>
+    </w:p>
+    <w:p>
+      <w:pPr>
+        <w:pStyle w:val="Heading3"/>
+      </w:pPr>
+      <w:r>
+        <w:rPr>
+          <w:b/>
+          <w:color w:val="1F497D"/>
+        </w:rPr>
+        <w:t>• Complete Pipeline Steps:</w:t>
+      </w:r>
+    </w:p>
+    <w:p>
+      <w:pPr>
+        <w:ind w:left="360"/>
+      </w:pPr>
+      <w:r>
+        <w:rPr>
+          <w:b/>
+        </w:rPr>
+        <w:t>  1. Code Checkout (actions/checkout@v4).</w:t>
+      </w:r>
+    </w:p>
+    <w:p>
+      <w:pPr>
+        <w:ind w:left="360"/>
+      </w:pPr>
+      <w:r>
+        <w:rPr>
+          <w:b/>
+        </w:rPr>
+        <w:t>  2. Set up JDK 21 (actions/setup-java@v5).</w:t>
+      </w:r>
+    </w:p>
+    <w:p>
+      <w:pPr>
+        <w:ind w:left="360"/>
+      </w:pPr>
+      <w:r>
+        <w:rPr>
+          <w:b/>
+        </w:rPr>
+        <w:t>  3. Clean Maven Compilation (./mvnw clean compile).</w:t>
+      </w:r>
+    </w:p>
+    <w:p>
+      <w:pPr>
+        <w:ind w:left="360"/>
+      </w:pPr>
+      <w:r>
+        <w:rPr>
+          <w:b/>
+        </w:rPr>
+        <w:t>  4. Unit Testing (./mvnw test).</w:t>
+      </w:r>
+    </w:p>
+    <w:p>
+      <w:pPr>
+        <w:ind w:left="360"/>
+      </w:pPr>
+      <w:r>
+        <w:t>  5. Integration Testing with Testcontainers (Real Postgres/Redis containers).</w:t>
+      </w:r>
+    </w:p>
+    <w:p>
+      <w:pPr>
+        <w:ind w:left="360"/>
+      </w:pPr>
+      <w:r>
+        <w:t>  6. Contract Testing with Pact.</w:t>
+      </w:r>
+    </w:p>
+    <w:p>
+      <w:pPr>
+        <w:ind w:left="360"/>
+      </w:pPr>
+      <w:r>
+        <w:t>  7. Static Code Analysis via SonarQube.</w:t>
+      </w:r>
+    </w:p>
+    <w:p>
+      <w:pPr>
+        <w:ind w:left="360"/>
+      </w:pPr>
+      <w:r>
+        <w:t>  8. Dependency Vulnerability Scan via Trivy.</w:t>
+      </w:r>
+    </w:p>
+    <w:p>
+      <w:pPr>
+        <w:ind w:left="360"/>
+      </w:pPr>
+      <w:r>
+        <w:t>  9. Harbor Registry Login.</w:t>
+      </w:r>
+    </w:p>
+    <w:p>
+      <w:pPr>
+        <w:ind w:left="360"/>
+      </w:pPr>
+      <w:r>
+        <w:t>  10-13. Multi-service Docker Build &amp; Version Tagging (dropzone/*:MAJOR.MINOR.PATCH).</w:t>
+      </w:r>
+    </w:p>
+    <w:p>
+      <w:pPr>
+        <w:ind w:left="360"/>
+      </w:pPr>
+      <w:r>
+        <w:t>  14. Container Vulnerability Scan via Trivy.</w:t>
+      </w:r>
+    </w:p>
+    <w:p>
+      <w:pPr>
+        <w:ind w:left="360"/>
+      </w:pPr>
+      <w:r>
+        <w:t>  15. Image Push to Harbor Registry.</w:t>
+      </w:r>
+    </w:p>
+    <w:p>
+      <w:pPr>
+        <w:ind w:left="360"/>
+      </w:pPr>
+      <w:r>
+        <w:t>  16. Automated Staging Lab Deployment via Ansible playbooks.</w:t>
+      </w:r>
+    </w:p>
+    <w:p>
+      <w:pPr>
+        <w:pStyle w:val="Heading3"/>
+      </w:pPr>
+      <w:r>
+        <w:rPr>
+          <w:b/>
           <w:color w:val="2E74B5"/>
         </w:rPr>
         <w:t>GitHub Actions CI/CD Pipeline Details:</w:t>
@@ -12635,6 +15255,51 @@
       </w:pPr>
       <w:r>
         <w:t>37. VM Deployment, NGINX, Ansible, Terraform, and Staging</w:t>
+      </w:r>
+    </w:p>
+    <w:p>
+      <w:pPr>
+        <w:pStyle w:val="Heading3"/>
+      </w:pPr>
+      <w:r>
+        <w:rPr>
+          <w:b/>
+          <w:color w:val="1F497D"/>
+        </w:rPr>
+        <w:t>MULTI-VM STAGING LAB &amp; ANSIBLE DEPLOYMENT:</w:t>
+      </w:r>
+    </w:p>
+    <w:p>
+      <w:pPr>
+        <w:ind w:left="360"/>
+      </w:pPr>
+      <w:r>
+        <w:rPr>
+          <w:b/>
+        </w:rPr>
+        <w:t>• Vagrant Infrastructure: infrastructure/lab/vagrant/Vagrantfile provisions 4 Ubuntu 24.04 VMs (edge-01, app-01, app-02, infra-01).</w:t>
+      </w:r>
+    </w:p>
+    <w:p>
+      <w:pPr>
+        <w:ind w:left="360"/>
+      </w:pPr>
+      <w:r>
+        <w:rPr>
+          <w:b/>
+        </w:rPr>
+        <w:t>• Ansible Orchestration: Playbooks (site.yml, update-service-image.yml, rollback-service-image.yml) automate container image pulls, rolling restarts, and health check validation.</w:t>
+      </w:r>
+    </w:p>
+    <w:p>
+      <w:pPr>
+        <w:ind w:left="360"/>
+      </w:pPr>
+      <w:r>
+        <w:rPr>
+          <w:b/>
+        </w:rPr>
+        <w:t>• Zero-Touch Boot Recovery: Containers use restart: unless-stopped for automatic recovery upon VM reboot.</w:t>
       </w:r>
     </w:p>
     <w:p>

</xml_diff>